<commit_message>
docs(epic-1): add PR code links to report
</commit_message>
<xml_diff>
--- a/ai_14/danylo_burban/epic_1/epic_1_report_danylo_burban.docx
+++ b/ai_14/danylo_burban/epic_1/epic_1_report_danylo_burban.docx
@@ -1630,13 +1630,7 @@
           <w:rPr>
             <w:rStyle w:val="a6"/>
           </w:rPr>
-          <w:t>Li</w:t>
-        </w:r>
-        <w:r>
-          <w:rPr>
-            <w:rStyle w:val="a6"/>
-          </w:rPr>
-          <w:t>nux</w:t>
+          <w:t>Linux</w:t>
         </w:r>
         <w:proofErr w:type="spellEnd"/>
         <w:r>
@@ -4666,19 +4660,7 @@
         <w:rPr>
           <w:color w:val="000000"/>
         </w:rPr>
-        <w:t>Завдання №1</w:t>
-      </w:r>
-      <w:r>
-        <w:rPr>
-          <w:color w:val="000000"/>
-        </w:rPr>
-        <w:t>1</w:t>
-      </w:r>
-      <w:r>
-        <w:rPr>
-          <w:color w:val="000000"/>
-        </w:rPr>
-        <w:t xml:space="preserve"> </w:t>
+        <w:t xml:space="preserve">Завдання №11 </w:t>
       </w:r>
       <w:proofErr w:type="spellStart"/>
       <w:r>
@@ -4974,89 +4956,89 @@
           <w:iCs/>
           <w:color w:val="000000"/>
         </w:rPr>
-        <w:t>a</w:t>
-      </w:r>
+        <w:t>are</w:t>
+      </w:r>
+      <w:proofErr w:type="spellEnd"/>
       <w:r>
         <w:rPr>
           <w:i/>
           <w:iCs/>
           <w:color w:val="000000"/>
         </w:rPr>
-        <w:t>re</w:t>
-      </w:r>
-      <w:proofErr w:type="spellEnd"/>
+        <w:t xml:space="preserve"> </w:t>
+      </w:r>
+      <w:proofErr w:type="spellStart"/>
       <w:r>
         <w:rPr>
           <w:i/>
           <w:iCs/>
           <w:color w:val="000000"/>
         </w:rPr>
-        <w:t xml:space="preserve"> </w:t>
-      </w:r>
-      <w:proofErr w:type="spellStart"/>
+        <w:t>playing</w:t>
+      </w:r>
+      <w:proofErr w:type="spellEnd"/>
       <w:r>
         <w:rPr>
           <w:i/>
           <w:iCs/>
           <w:color w:val="000000"/>
         </w:rPr>
-        <w:t>playing</w:t>
-      </w:r>
-      <w:proofErr w:type="spellEnd"/>
+        <w:t xml:space="preserve"> </w:t>
+      </w:r>
+      <w:proofErr w:type="spellStart"/>
       <w:r>
         <w:rPr>
           <w:i/>
           <w:iCs/>
           <w:color w:val="000000"/>
         </w:rPr>
-        <w:t xml:space="preserve"> </w:t>
-      </w:r>
-      <w:proofErr w:type="spellStart"/>
+        <w:t>an</w:t>
+      </w:r>
+      <w:proofErr w:type="spellEnd"/>
       <w:r>
         <w:rPr>
           <w:i/>
           <w:iCs/>
           <w:color w:val="000000"/>
         </w:rPr>
-        <w:t>an</w:t>
-      </w:r>
-      <w:proofErr w:type="spellEnd"/>
+        <w:t xml:space="preserve"> </w:t>
+      </w:r>
+      <w:proofErr w:type="spellStart"/>
       <w:r>
         <w:rPr>
           <w:i/>
           <w:iCs/>
           <w:color w:val="000000"/>
         </w:rPr>
-        <w:t xml:space="preserve"> </w:t>
-      </w:r>
-      <w:proofErr w:type="spellStart"/>
+        <w:t>interesting</w:t>
+      </w:r>
+      <w:proofErr w:type="spellEnd"/>
       <w:r>
         <w:rPr>
           <w:i/>
           <w:iCs/>
           <w:color w:val="000000"/>
         </w:rPr>
-        <w:t>interesting</w:t>
-      </w:r>
-      <w:proofErr w:type="spellEnd"/>
+        <w:t xml:space="preserve"> </w:t>
+      </w:r>
+      <w:proofErr w:type="spellStart"/>
       <w:r>
         <w:rPr>
           <w:i/>
           <w:iCs/>
           <w:color w:val="000000"/>
         </w:rPr>
-        <w:t xml:space="preserve"> </w:t>
-      </w:r>
-      <w:proofErr w:type="spellStart"/>
+        <w:t>game</w:t>
+      </w:r>
+      <w:proofErr w:type="spellEnd"/>
       <w:r>
         <w:rPr>
           <w:i/>
           <w:iCs/>
           <w:color w:val="000000"/>
         </w:rPr>
-        <w:t>game.</w:t>
-      </w:r>
-      <w:proofErr w:type="spellEnd"/>
+        <w:t>.</w:t>
+      </w:r>
       <w:r>
         <w:rPr>
           <w:i/>
@@ -6027,15 +6009,7 @@
           <w:iCs/>
           <w:color w:val="000000"/>
         </w:rPr>
-        <w:t>opponen</w:t>
-      </w:r>
-      <w:r>
-        <w:rPr>
-          <w:i/>
-          <w:iCs/>
-          <w:color w:val="000000"/>
-        </w:rPr>
-        <w:t>t</w:t>
+        <w:t>opponent</w:t>
       </w:r>
       <w:proofErr w:type="spellEnd"/>
       <w:r>
@@ -6429,9 +6403,9 @@
       </w:pPr>
       <w:r>
         <w:rPr>
-          <w:color w:val="000000"/>
-        </w:rPr>
-        <w:lastRenderedPageBreak/>
+          <w:noProof/>
+          <w:color w:val="000000"/>
+        </w:rPr>
         <w:drawing>
           <wp:anchor distT="0" distB="0" distL="114300" distR="114300" simplePos="0" relativeHeight="251668480" behindDoc="0" locked="0" layoutInCell="1" allowOverlap="1" wp14:anchorId="297128A3" wp14:editId="7530C8D5">
             <wp:simplePos x="0" y="0"/>
@@ -6724,13 +6698,7 @@
                               <w:rPr>
                                 <w:lang w:val="uk-UA"/>
                               </w:rPr>
-                              <w:t xml:space="preserve"> </w:t>
-                            </w:r>
-                            <w:r>
-                              <w:rPr>
-                                <w:lang w:val="uk-UA"/>
-                              </w:rPr>
-                              <w:t>блок-схема</w:t>
+                              <w:t xml:space="preserve"> блок-схема</w:t>
                             </w:r>
                             <w:r>
                               <w:rPr>
@@ -6854,13 +6822,7 @@
                               <w:rPr>
                                 <w:lang w:val="uk-UA"/>
                               </w:rPr>
-                              <w:t xml:space="preserve"> </w:t>
-                            </w:r>
-                            <w:r>
-                              <w:rPr>
-                                <w:lang w:val="uk-UA"/>
-                              </w:rPr>
-                              <w:t>блок-схема</w:t>
+                              <w:t xml:space="preserve"> блок-схема</w:t>
                             </w:r>
                             <w:r>
                               <w:rPr>
@@ -7060,7 +7022,6 @@
           <w:sz w:val="24"/>
           <w:szCs w:val="24"/>
         </w:rPr>
-        <w:lastRenderedPageBreak/>
         <w:t>3.</w:t>
       </w:r>
       <w:r>
@@ -7134,6 +7095,7 @@
       </w:r>
       <w:r>
         <w:rPr>
+          <w:noProof/>
           <w:color w:val="000000"/>
         </w:rPr>
         <w:drawing>
@@ -7289,8 +7251,8 @@
       </w:pPr>
       <w:r>
         <w:rPr>
-          <w:color w:val="000000"/>
-          <w:lang w:val="en-US"/>
+          <w:noProof/>
+          <w:color w:val="000000"/>
         </w:rPr>
         <w:drawing>
           <wp:inline distT="0" distB="0" distL="0" distR="0" wp14:anchorId="022AA9B0" wp14:editId="39BC87D9">
@@ -7509,11 +7471,11 @@
       <w:r>
         <w:rPr>
           <w:rFonts w:ascii="Times New Roman" w:hAnsi="Times New Roman" w:cs="Times New Roman"/>
-          <w:sz w:val="24"/>
-          <w:szCs w:val="24"/>
-          <w:lang w:val="uk-UA"/>
-        </w:rPr>
-        <w:lastRenderedPageBreak/>
+          <w:noProof/>
+          <w:sz w:val="24"/>
+          <w:szCs w:val="24"/>
+          <w:lang w:val="uk-UA"/>
+        </w:rPr>
         <w:drawing>
           <wp:inline distT="0" distB="0" distL="0" distR="0" wp14:anchorId="2621386B" wp14:editId="637E3A7C">
             <wp:extent cx="5733415" cy="4311650"/>
@@ -7736,6 +7698,7 @@
       </w:pPr>
       <w:r>
         <w:rPr>
+          <w:noProof/>
           <w:color w:val="000000"/>
         </w:rPr>
         <w:drawing>
@@ -7815,6 +7778,9 @@
         <w:jc w:val="center"/>
       </w:pPr>
       <w:r>
+        <w:rPr>
+          <w:noProof/>
+        </w:rPr>
         <w:drawing>
           <wp:inline distT="0" distB="0" distL="0" distR="0" wp14:anchorId="58F8DDAE" wp14:editId="5E5D32C0">
             <wp:extent cx="2305372" cy="809738"/>
@@ -7917,6 +7883,7 @@
           <w:noProof/>
           <w:sz w:val="24"/>
           <w:szCs w:val="24"/>
+          <w:lang w:val="uk-UA"/>
         </w:rPr>
         <mc:AlternateContent>
           <mc:Choice Requires="wps">
@@ -8029,8 +7996,10 @@
       <w:r>
         <w:rPr>
           <w:rFonts w:ascii="Times New Roman" w:hAnsi="Times New Roman" w:cs="Times New Roman"/>
-          <w:sz w:val="24"/>
-          <w:szCs w:val="24"/>
+          <w:noProof/>
+          <w:sz w:val="24"/>
+          <w:szCs w:val="24"/>
+          <w:lang w:val="uk-UA"/>
         </w:rPr>
         <w:drawing>
           <wp:anchor distT="0" distB="0" distL="114300" distR="114300" simplePos="0" relativeHeight="251669504" behindDoc="0" locked="0" layoutInCell="1" allowOverlap="1" wp14:anchorId="137F07FD" wp14:editId="0B6225D8">
@@ -8094,6 +8063,7 @@
           <w:noProof/>
           <w:sz w:val="24"/>
           <w:szCs w:val="24"/>
+          <w:lang w:val="uk-UA"/>
         </w:rPr>
         <mc:AlternateContent>
           <mc:Choice Requires="wps">
@@ -8206,9 +8176,10 @@
       <w:r>
         <w:rPr>
           <w:rFonts w:ascii="Times New Roman" w:hAnsi="Times New Roman" w:cs="Times New Roman"/>
-          <w:sz w:val="24"/>
-          <w:szCs w:val="24"/>
-          <w:lang w:val="en-US"/>
+          <w:noProof/>
+          <w:sz w:val="24"/>
+          <w:szCs w:val="24"/>
+          <w:lang w:val="uk-UA"/>
         </w:rPr>
         <w:drawing>
           <wp:anchor distT="0" distB="0" distL="114300" distR="114300" simplePos="0" relativeHeight="251670528" behindDoc="0" locked="0" layoutInCell="1" allowOverlap="1" wp14:anchorId="5E5F93BD" wp14:editId="13B3996C">
@@ -8318,7 +8289,6 @@
         <w:rPr>
           <w:color w:val="000000"/>
         </w:rPr>
-        <w:lastRenderedPageBreak/>
         <w:t>Завдання №</w:t>
       </w:r>
       <w:r>
@@ -8463,6 +8433,7 @@
       </w:pPr>
       <w:r>
         <w:rPr>
+          <w:noProof/>
           <w:color w:val="000000"/>
         </w:rPr>
         <w:drawing>
@@ -8546,6 +8517,7 @@
       </w:r>
       <w:r>
         <w:rPr>
+          <w:noProof/>
           <w:color w:val="000000"/>
         </w:rPr>
         <w:drawing>
@@ -9483,7 +9455,6 @@
           <w:szCs w:val="24"/>
           <w:lang w:val="uk-UA"/>
         </w:rPr>
-        <w:lastRenderedPageBreak/>
         <w:t xml:space="preserve">    </w:t>
       </w:r>
       <w:proofErr w:type="spellStart"/>
@@ -13140,7 +13111,6 @@
           <w:szCs w:val="24"/>
           <w:lang w:val="uk-UA"/>
         </w:rPr>
-        <w:lastRenderedPageBreak/>
         <w:t xml:space="preserve">    </w:t>
       </w:r>
       <w:proofErr w:type="spellStart"/>
@@ -17755,22 +17725,14 @@
         </w:rPr>
         <w:t xml:space="preserve">: </w:t>
       </w:r>
-      <w:r>
-        <w:rPr>
-          <w:color w:val="000000"/>
-          <w:shd w:val="clear" w:color="auto" w:fill="FFF2CC"/>
-        </w:rPr>
-        <w:t xml:space="preserve">вставляєте посилання на файл в </w:t>
-      </w:r>
-      <w:proofErr w:type="spellStart"/>
-      <w:r>
-        <w:rPr>
-          <w:color w:val="000000"/>
-          <w:shd w:val="clear" w:color="auto" w:fill="FFF2CC"/>
-        </w:rPr>
-        <w:t>пулреквесті</w:t>
-      </w:r>
-      <w:proofErr w:type="spellEnd"/>
+      <w:hyperlink r:id="rId31" w:history="1">
+        <w:r>
+          <w:rPr>
+            <w:rStyle w:val="a6"/>
+          </w:rPr>
+          <w:t>посилання на 1 задачу</w:t>
+        </w:r>
+      </w:hyperlink>
     </w:p>
     <w:p>
       <w:pPr>
@@ -17889,7 +17851,6 @@
           <w:szCs w:val="24"/>
           <w:lang w:val="uk-UA"/>
         </w:rPr>
-        <w:lastRenderedPageBreak/>
         <w:t xml:space="preserve"> /*Епік 1. </w:t>
       </w:r>
       <w:proofErr w:type="spellStart"/>
@@ -19304,22 +19265,16 @@
         </w:rPr>
         <w:t xml:space="preserve">: </w:t>
       </w:r>
-      <w:r>
-        <w:rPr>
-          <w:color w:val="000000"/>
-          <w:shd w:val="clear" w:color="auto" w:fill="FFF2CC"/>
-        </w:rPr>
-        <w:t xml:space="preserve">вставляєте посилання на файл в </w:t>
-      </w:r>
-      <w:proofErr w:type="spellStart"/>
-      <w:r>
-        <w:rPr>
-          <w:color w:val="000000"/>
-          <w:shd w:val="clear" w:color="auto" w:fill="FFF2CC"/>
-        </w:rPr>
-        <w:t>пулреквесті</w:t>
-      </w:r>
-      <w:proofErr w:type="spellEnd"/>
+      <w:hyperlink r:id="rId32" w:history="1">
+        <w:r>
+          <w:rPr>
+            <w:rStyle w:val="a6"/>
+          </w:rPr>
+          <w:t>посилання на 2 задачу</w:t>
+        </w:r>
+      </w:hyperlink>
+      <w:bookmarkStart w:id="0" w:name="_GoBack"/>
+      <w:bookmarkEnd w:id="0"/>
     </w:p>
     <w:p>
       <w:pPr>
@@ -19384,6 +19339,7 @@
       </w:pPr>
       <w:r>
         <w:rPr>
+          <w:noProof/>
           <w:color w:val="000000"/>
           <w:shd w:val="clear" w:color="auto" w:fill="FFF2CC"/>
         </w:rPr>
@@ -19392,255 +19348,6 @@
             <wp:extent cx="4714875" cy="2971800"/>
             <wp:effectExtent l="0" t="0" r="9525" b="0"/>
             <wp:docPr id="32" name="Рисунок 32"/>
-            <wp:cNvGraphicFramePr>
-              <a:graphicFrameLocks xmlns:a="http://schemas.openxmlformats.org/drawingml/2006/main" noChangeAspect="1"/>
-            </wp:cNvGraphicFramePr>
-            <a:graphic xmlns:a="http://schemas.openxmlformats.org/drawingml/2006/main">
-              <a:graphicData uri="http://schemas.openxmlformats.org/drawingml/2006/picture">
-                <pic:pic xmlns:pic="http://schemas.openxmlformats.org/drawingml/2006/picture">
-                  <pic:nvPicPr>
-                    <pic:cNvPr id="1" name=""/>
-                    <pic:cNvPicPr/>
-                  </pic:nvPicPr>
-                  <pic:blipFill>
-                    <a:blip r:embed="rId31"/>
-                    <a:stretch>
-                      <a:fillRect/>
-                    </a:stretch>
-                  </pic:blipFill>
-                  <pic:spPr>
-                    <a:xfrm>
-                      <a:off x="0" y="0"/>
-                      <a:ext cx="4715557" cy="2972230"/>
-                    </a:xfrm>
-                    <a:prstGeom prst="rect">
-                      <a:avLst/>
-                    </a:prstGeom>
-                  </pic:spPr>
-                </pic:pic>
-              </a:graphicData>
-            </a:graphic>
-          </wp:inline>
-        </w:drawing>
-      </w:r>
-    </w:p>
-    <w:p>
-      <w:pPr>
-        <w:pStyle w:val="a9"/>
-        <w:jc w:val="center"/>
-        <w:rPr>
-          <w:rFonts w:ascii="Times New Roman" w:hAnsi="Times New Roman" w:cs="Times New Roman"/>
-          <w:sz w:val="24"/>
-          <w:szCs w:val="24"/>
-          <w:lang w:val="uk-UA"/>
-        </w:rPr>
-      </w:pPr>
-      <w:r>
-        <w:rPr>
-          <w:rFonts w:ascii="Times New Roman" w:hAnsi="Times New Roman" w:cs="Times New Roman"/>
-          <w:sz w:val="24"/>
-          <w:szCs w:val="24"/>
-          <w:lang w:val="uk-UA"/>
-        </w:rPr>
-        <w:t>Вивід за коректного введення даних</w:t>
-      </w:r>
-    </w:p>
-    <w:p>
-      <w:pPr>
-        <w:keepNext/>
-        <w:jc w:val="center"/>
-        <w:rPr>
-          <w:rFonts w:ascii="Times New Roman" w:hAnsi="Times New Roman" w:cs="Times New Roman"/>
-          <w:sz w:val="24"/>
-          <w:szCs w:val="24"/>
-        </w:rPr>
-      </w:pPr>
-      <w:r>
-        <w:rPr>
-          <w:rFonts w:ascii="Times New Roman" w:hAnsi="Times New Roman" w:cs="Times New Roman"/>
-          <w:sz w:val="24"/>
-          <w:szCs w:val="24"/>
-          <w:lang w:val="en-US"/>
-        </w:rPr>
-        <w:lastRenderedPageBreak/>
-        <w:drawing>
-          <wp:inline distT="0" distB="0" distL="0" distR="0" wp14:anchorId="0F861FC1" wp14:editId="277CEFB4">
-            <wp:extent cx="4163006" cy="1143160"/>
-            <wp:effectExtent l="0" t="0" r="0" b="0"/>
-            <wp:docPr id="33" name="Рисунок 33"/>
-            <wp:cNvGraphicFramePr>
-              <a:graphicFrameLocks xmlns:a="http://schemas.openxmlformats.org/drawingml/2006/main" noChangeAspect="1"/>
-            </wp:cNvGraphicFramePr>
-            <a:graphic xmlns:a="http://schemas.openxmlformats.org/drawingml/2006/main">
-              <a:graphicData uri="http://schemas.openxmlformats.org/drawingml/2006/picture">
-                <pic:pic xmlns:pic="http://schemas.openxmlformats.org/drawingml/2006/picture">
-                  <pic:nvPicPr>
-                    <pic:cNvPr id="1" name=""/>
-                    <pic:cNvPicPr/>
-                  </pic:nvPicPr>
-                  <pic:blipFill>
-                    <a:blip r:embed="rId32"/>
-                    <a:stretch>
-                      <a:fillRect/>
-                    </a:stretch>
-                  </pic:blipFill>
-                  <pic:spPr>
-                    <a:xfrm>
-                      <a:off x="0" y="0"/>
-                      <a:ext cx="4163006" cy="1143160"/>
-                    </a:xfrm>
-                    <a:prstGeom prst="rect">
-                      <a:avLst/>
-                    </a:prstGeom>
-                  </pic:spPr>
-                </pic:pic>
-              </a:graphicData>
-            </a:graphic>
-          </wp:inline>
-        </w:drawing>
-      </w:r>
-    </w:p>
-    <w:p>
-      <w:pPr>
-        <w:pStyle w:val="a9"/>
-        <w:jc w:val="center"/>
-        <w:rPr>
-          <w:rFonts w:ascii="Times New Roman" w:hAnsi="Times New Roman" w:cs="Times New Roman"/>
-          <w:sz w:val="24"/>
-          <w:szCs w:val="24"/>
-          <w:lang w:val="ru-RU"/>
-        </w:rPr>
-      </w:pPr>
-      <w:r>
-        <w:rPr>
-          <w:rFonts w:ascii="Times New Roman" w:hAnsi="Times New Roman" w:cs="Times New Roman"/>
-          <w:sz w:val="24"/>
-          <w:szCs w:val="24"/>
-          <w:lang w:val="uk-UA"/>
-        </w:rPr>
-        <w:t xml:space="preserve">Вивід за некоректного </w:t>
-      </w:r>
-      <w:proofErr w:type="spellStart"/>
-      <w:r>
-        <w:rPr>
-          <w:rFonts w:ascii="Times New Roman" w:hAnsi="Times New Roman" w:cs="Times New Roman"/>
-          <w:sz w:val="24"/>
-          <w:szCs w:val="24"/>
-          <w:lang w:val="uk-UA"/>
-        </w:rPr>
-        <w:t>введеня</w:t>
-      </w:r>
-      <w:proofErr w:type="spellEnd"/>
-    </w:p>
-    <w:p>
-      <w:pPr>
-        <w:pStyle w:val="a5"/>
-        <w:spacing w:before="0" w:beforeAutospacing="0" w:after="200" w:afterAutospacing="0"/>
-        <w:rPr>
-          <w:color w:val="000000"/>
-          <w:shd w:val="clear" w:color="auto" w:fill="FFF2CC"/>
-        </w:rPr>
-      </w:pPr>
-      <w:r>
-        <w:rPr>
-          <w:color w:val="000000"/>
-        </w:rPr>
-        <w:t>Час за</w:t>
-      </w:r>
-      <w:r>
-        <w:rPr>
-          <w:color w:val="000000"/>
-        </w:rPr>
-        <w:t>трачений на виконання завдання: 2 години</w:t>
-      </w:r>
-    </w:p>
-    <w:p>
-      <w:pPr>
-        <w:pStyle w:val="a5"/>
-        <w:spacing w:before="0" w:beforeAutospacing="0" w:after="200" w:afterAutospacing="0"/>
-      </w:pPr>
-      <w:r>
-        <w:rPr>
-          <w:color w:val="000000"/>
-        </w:rPr>
-        <w:t>Завдання №2</w:t>
-      </w:r>
-      <w:r>
-        <w:rPr>
-          <w:color w:val="000000"/>
-        </w:rPr>
-        <w:t xml:space="preserve"> </w:t>
-      </w:r>
-      <w:proofErr w:type="spellStart"/>
-      <w:r>
-        <w:rPr>
-          <w:color w:val="000000"/>
-        </w:rPr>
-        <w:t>Algotester</w:t>
-      </w:r>
-      <w:proofErr w:type="spellEnd"/>
-      <w:r>
-        <w:rPr>
-          <w:color w:val="000000"/>
-        </w:rPr>
-        <w:t xml:space="preserve"> </w:t>
-      </w:r>
-      <w:proofErr w:type="spellStart"/>
-      <w:r>
-        <w:rPr>
-          <w:color w:val="000000"/>
-        </w:rPr>
-        <w:t>task</w:t>
-      </w:r>
-      <w:proofErr w:type="spellEnd"/>
-      <w:r>
-        <w:rPr>
-          <w:color w:val="000000"/>
-        </w:rPr>
-        <w:t>: "</w:t>
-      </w:r>
-      <w:proofErr w:type="spellStart"/>
-      <w:r>
-        <w:rPr>
-          <w:color w:val="000000"/>
-        </w:rPr>
-        <w:t>Interesting</w:t>
-      </w:r>
-      <w:proofErr w:type="spellEnd"/>
-      <w:r>
-        <w:rPr>
-          <w:color w:val="000000"/>
-        </w:rPr>
-        <w:t xml:space="preserve"> </w:t>
-      </w:r>
-      <w:proofErr w:type="spellStart"/>
-      <w:r>
-        <w:rPr>
-          <w:color w:val="000000"/>
-        </w:rPr>
-        <w:t>Game</w:t>
-      </w:r>
-      <w:proofErr w:type="spellEnd"/>
-      <w:r>
-        <w:rPr>
-          <w:color w:val="000000"/>
-        </w:rPr>
-        <w:t>"</w:t>
-      </w:r>
-    </w:p>
-    <w:p>
-      <w:pPr>
-        <w:pStyle w:val="a5"/>
-        <w:keepNext/>
-        <w:spacing w:before="0" w:beforeAutospacing="0" w:after="200" w:afterAutospacing="0"/>
-        <w:jc w:val="center"/>
-      </w:pPr>
-      <w:r>
-        <w:drawing>
-          <wp:inline distT="0" distB="0" distL="0" distR="0" wp14:anchorId="510D2805" wp14:editId="00C51705">
-            <wp:extent cx="1629002" cy="523948"/>
-            <wp:effectExtent l="0" t="0" r="9525" b="9525"/>
-            <wp:docPr id="34" name="Рисунок 34"/>
             <wp:cNvGraphicFramePr>
               <a:graphicFrameLocks xmlns:a="http://schemas.openxmlformats.org/drawingml/2006/main" noChangeAspect="1"/>
             </wp:cNvGraphicFramePr>
@@ -19660,6 +19367,258 @@
                   <pic:spPr>
                     <a:xfrm>
                       <a:off x="0" y="0"/>
+                      <a:ext cx="4715557" cy="2972230"/>
+                    </a:xfrm>
+                    <a:prstGeom prst="rect">
+                      <a:avLst/>
+                    </a:prstGeom>
+                  </pic:spPr>
+                </pic:pic>
+              </a:graphicData>
+            </a:graphic>
+          </wp:inline>
+        </w:drawing>
+      </w:r>
+    </w:p>
+    <w:p>
+      <w:pPr>
+        <w:pStyle w:val="a9"/>
+        <w:jc w:val="center"/>
+        <w:rPr>
+          <w:rFonts w:ascii="Times New Roman" w:hAnsi="Times New Roman" w:cs="Times New Roman"/>
+          <w:sz w:val="24"/>
+          <w:szCs w:val="24"/>
+          <w:lang w:val="uk-UA"/>
+        </w:rPr>
+      </w:pPr>
+      <w:r>
+        <w:rPr>
+          <w:rFonts w:ascii="Times New Roman" w:hAnsi="Times New Roman" w:cs="Times New Roman"/>
+          <w:sz w:val="24"/>
+          <w:szCs w:val="24"/>
+          <w:lang w:val="uk-UA"/>
+        </w:rPr>
+        <w:t>Вивід за коректного введення даних</w:t>
+      </w:r>
+    </w:p>
+    <w:p>
+      <w:pPr>
+        <w:keepNext/>
+        <w:jc w:val="center"/>
+        <w:rPr>
+          <w:rFonts w:ascii="Times New Roman" w:hAnsi="Times New Roman" w:cs="Times New Roman"/>
+          <w:sz w:val="24"/>
+          <w:szCs w:val="24"/>
+        </w:rPr>
+      </w:pPr>
+      <w:r>
+        <w:rPr>
+          <w:rFonts w:ascii="Times New Roman" w:hAnsi="Times New Roman" w:cs="Times New Roman"/>
+          <w:noProof/>
+          <w:sz w:val="24"/>
+          <w:szCs w:val="24"/>
+          <w:lang w:val="uk-UA"/>
+        </w:rPr>
+        <w:drawing>
+          <wp:inline distT="0" distB="0" distL="0" distR="0" wp14:anchorId="0F861FC1" wp14:editId="277CEFB4">
+            <wp:extent cx="4163006" cy="1143160"/>
+            <wp:effectExtent l="0" t="0" r="0" b="0"/>
+            <wp:docPr id="33" name="Рисунок 33"/>
+            <wp:cNvGraphicFramePr>
+              <a:graphicFrameLocks xmlns:a="http://schemas.openxmlformats.org/drawingml/2006/main" noChangeAspect="1"/>
+            </wp:cNvGraphicFramePr>
+            <a:graphic xmlns:a="http://schemas.openxmlformats.org/drawingml/2006/main">
+              <a:graphicData uri="http://schemas.openxmlformats.org/drawingml/2006/picture">
+                <pic:pic xmlns:pic="http://schemas.openxmlformats.org/drawingml/2006/picture">
+                  <pic:nvPicPr>
+                    <pic:cNvPr id="1" name=""/>
+                    <pic:cNvPicPr/>
+                  </pic:nvPicPr>
+                  <pic:blipFill>
+                    <a:blip r:embed="rId34"/>
+                    <a:stretch>
+                      <a:fillRect/>
+                    </a:stretch>
+                  </pic:blipFill>
+                  <pic:spPr>
+                    <a:xfrm>
+                      <a:off x="0" y="0"/>
+                      <a:ext cx="4163006" cy="1143160"/>
+                    </a:xfrm>
+                    <a:prstGeom prst="rect">
+                      <a:avLst/>
+                    </a:prstGeom>
+                  </pic:spPr>
+                </pic:pic>
+              </a:graphicData>
+            </a:graphic>
+          </wp:inline>
+        </w:drawing>
+      </w:r>
+    </w:p>
+    <w:p>
+      <w:pPr>
+        <w:pStyle w:val="a9"/>
+        <w:jc w:val="center"/>
+        <w:rPr>
+          <w:rFonts w:ascii="Times New Roman" w:hAnsi="Times New Roman" w:cs="Times New Roman"/>
+          <w:sz w:val="24"/>
+          <w:szCs w:val="24"/>
+          <w:lang w:val="ru-RU"/>
+        </w:rPr>
+      </w:pPr>
+      <w:r>
+        <w:rPr>
+          <w:rFonts w:ascii="Times New Roman" w:hAnsi="Times New Roman" w:cs="Times New Roman"/>
+          <w:sz w:val="24"/>
+          <w:szCs w:val="24"/>
+          <w:lang w:val="uk-UA"/>
+        </w:rPr>
+        <w:t xml:space="preserve">Вивід за некоректного </w:t>
+      </w:r>
+      <w:proofErr w:type="spellStart"/>
+      <w:r>
+        <w:rPr>
+          <w:rFonts w:ascii="Times New Roman" w:hAnsi="Times New Roman" w:cs="Times New Roman"/>
+          <w:sz w:val="24"/>
+          <w:szCs w:val="24"/>
+          <w:lang w:val="uk-UA"/>
+        </w:rPr>
+        <w:t>введеня</w:t>
+      </w:r>
+      <w:proofErr w:type="spellEnd"/>
+    </w:p>
+    <w:p>
+      <w:pPr>
+        <w:pStyle w:val="a5"/>
+        <w:spacing w:before="0" w:beforeAutospacing="0" w:after="200" w:afterAutospacing="0"/>
+        <w:rPr>
+          <w:color w:val="000000"/>
+          <w:shd w:val="clear" w:color="auto" w:fill="FFF2CC"/>
+        </w:rPr>
+      </w:pPr>
+      <w:r>
+        <w:rPr>
+          <w:color w:val="000000"/>
+        </w:rPr>
+        <w:t>Час за</w:t>
+      </w:r>
+      <w:r>
+        <w:rPr>
+          <w:color w:val="000000"/>
+        </w:rPr>
+        <w:t>трачений на виконання завдання: 2 години</w:t>
+      </w:r>
+    </w:p>
+    <w:p>
+      <w:pPr>
+        <w:pStyle w:val="a5"/>
+        <w:spacing w:before="0" w:beforeAutospacing="0" w:after="200" w:afterAutospacing="0"/>
+      </w:pPr>
+      <w:r>
+        <w:rPr>
+          <w:color w:val="000000"/>
+        </w:rPr>
+        <w:t>Завдання №2</w:t>
+      </w:r>
+      <w:r>
+        <w:rPr>
+          <w:color w:val="000000"/>
+        </w:rPr>
+        <w:t xml:space="preserve"> </w:t>
+      </w:r>
+      <w:proofErr w:type="spellStart"/>
+      <w:r>
+        <w:rPr>
+          <w:color w:val="000000"/>
+        </w:rPr>
+        <w:t>Algotester</w:t>
+      </w:r>
+      <w:proofErr w:type="spellEnd"/>
+      <w:r>
+        <w:rPr>
+          <w:color w:val="000000"/>
+        </w:rPr>
+        <w:t xml:space="preserve"> </w:t>
+      </w:r>
+      <w:proofErr w:type="spellStart"/>
+      <w:r>
+        <w:rPr>
+          <w:color w:val="000000"/>
+        </w:rPr>
+        <w:t>task</w:t>
+      </w:r>
+      <w:proofErr w:type="spellEnd"/>
+      <w:r>
+        <w:rPr>
+          <w:color w:val="000000"/>
+        </w:rPr>
+        <w:t>: "</w:t>
+      </w:r>
+      <w:proofErr w:type="spellStart"/>
+      <w:r>
+        <w:rPr>
+          <w:color w:val="000000"/>
+        </w:rPr>
+        <w:t>Interesting</w:t>
+      </w:r>
+      <w:proofErr w:type="spellEnd"/>
+      <w:r>
+        <w:rPr>
+          <w:color w:val="000000"/>
+        </w:rPr>
+        <w:t xml:space="preserve"> </w:t>
+      </w:r>
+      <w:proofErr w:type="spellStart"/>
+      <w:r>
+        <w:rPr>
+          <w:color w:val="000000"/>
+        </w:rPr>
+        <w:t>Game</w:t>
+      </w:r>
+      <w:proofErr w:type="spellEnd"/>
+      <w:r>
+        <w:rPr>
+          <w:color w:val="000000"/>
+        </w:rPr>
+        <w:t>"</w:t>
+      </w:r>
+    </w:p>
+    <w:p>
+      <w:pPr>
+        <w:pStyle w:val="a5"/>
+        <w:keepNext/>
+        <w:spacing w:before="0" w:beforeAutospacing="0" w:after="200" w:afterAutospacing="0"/>
+        <w:jc w:val="center"/>
+      </w:pPr>
+      <w:r>
+        <w:rPr>
+          <w:noProof/>
+        </w:rPr>
+        <w:drawing>
+          <wp:inline distT="0" distB="0" distL="0" distR="0" wp14:anchorId="510D2805" wp14:editId="00C51705">
+            <wp:extent cx="1629002" cy="523948"/>
+            <wp:effectExtent l="0" t="0" r="9525" b="9525"/>
+            <wp:docPr id="34" name="Рисунок 34"/>
+            <wp:cNvGraphicFramePr>
+              <a:graphicFrameLocks xmlns:a="http://schemas.openxmlformats.org/drawingml/2006/main" noChangeAspect="1"/>
+            </wp:cNvGraphicFramePr>
+            <a:graphic xmlns:a="http://schemas.openxmlformats.org/drawingml/2006/main">
+              <a:graphicData uri="http://schemas.openxmlformats.org/drawingml/2006/picture">
+                <pic:pic xmlns:pic="http://schemas.openxmlformats.org/drawingml/2006/picture">
+                  <pic:nvPicPr>
+                    <pic:cNvPr id="1" name=""/>
+                    <pic:cNvPicPr/>
+                  </pic:nvPicPr>
+                  <pic:blipFill>
+                    <a:blip r:embed="rId35"/>
+                    <a:stretch>
+                      <a:fillRect/>
+                    </a:stretch>
+                  </pic:blipFill>
+                  <pic:spPr>
+                    <a:xfrm>
+                      <a:off x="0" y="0"/>
                       <a:ext cx="1629002" cy="523948"/>
                     </a:xfrm>
                     <a:prstGeom prst="rect">
@@ -19735,6 +19694,7 @@
           <w:noProof/>
           <w:sz w:val="24"/>
           <w:szCs w:val="24"/>
+          <w:lang w:val="uk-UA"/>
         </w:rPr>
         <mc:AlternateContent>
           <mc:Choice Requires="wps">
@@ -19879,7 +19839,7 @@
                     </pic:cNvPicPr>
                   </pic:nvPicPr>
                   <pic:blipFill>
-                    <a:blip r:embed="rId34" cstate="print">
+                    <a:blip r:embed="rId36" cstate="print">
                       <a:extLst>
                         <a:ext uri="{28A0092B-C50C-407E-A947-70E740481C1C}">
                           <a14:useLocalDpi xmlns:a14="http://schemas.microsoft.com/office/drawing/2010/main" val="0"/>
@@ -19923,6 +19883,7 @@
           <w:color w:val="000000"/>
           <w:sz w:val="24"/>
           <w:szCs w:val="24"/>
+          <w:lang w:val="uk-UA"/>
         </w:rPr>
         <w:drawing>
           <wp:anchor distT="0" distB="0" distL="114300" distR="114300" simplePos="0" relativeHeight="251675648" behindDoc="0" locked="0" layoutInCell="1" allowOverlap="1" wp14:anchorId="791D099B" wp14:editId="6A06898D">
@@ -19950,7 +19911,7 @@
                     </pic:cNvPicPr>
                   </pic:nvPicPr>
                   <pic:blipFill>
-                    <a:blip r:embed="rId35" cstate="print">
+                    <a:blip r:embed="rId37" cstate="print">
                       <a:extLst>
                         <a:ext uri="{28A0092B-C50C-407E-A947-70E740481C1C}">
                           <a14:useLocalDpi xmlns:a14="http://schemas.microsoft.com/office/drawing/2010/main" val="0"/>
@@ -20089,16 +20050,7 @@
           <w:sz w:val="24"/>
           <w:szCs w:val="24"/>
         </w:rPr>
-        <w:t xml:space="preserve">Упродовж виконання поставлених завдань було здійснено комплексне ознайомлення з інструментарієм, необхідним для ефективної розробки програмного забезпечення </w:t>
-      </w:r>
-      <w:r>
-        <w:rPr>
-          <w:rFonts w:ascii="Times New Roman" w:hAnsi="Times New Roman" w:cs="Times New Roman"/>
-          <w:sz w:val="24"/>
-          <w:szCs w:val="24"/>
-        </w:rPr>
-        <w:lastRenderedPageBreak/>
-        <w:t xml:space="preserve">мовою C++. Отримані знання дозволяють перейти до складніших </w:t>
+        <w:t xml:space="preserve">Упродовж виконання поставлених завдань було здійснено комплексне ознайомлення з інструментарієм, необхідним для ефективної розробки програмного забезпечення мовою C++. Отримані знання дозволяють перейти до складніших </w:t>
       </w:r>
       <w:proofErr w:type="spellStart"/>
       <w:r>
@@ -20809,16 +20761,7 @@
           <w:sz w:val="24"/>
           <w:lang w:val="uk-UA"/>
         </w:rPr>
-        <w:t xml:space="preserve"> за </w:t>
-      </w:r>
-      <w:bookmarkStart w:id="0" w:name="_GoBack"/>
-      <w:r>
-        <w:rPr>
-          <w:rFonts w:ascii="Times New Roman" w:hAnsi="Times New Roman" w:cs="Times New Roman"/>
-          <w:sz w:val="24"/>
-          <w:lang w:val="uk-UA"/>
-        </w:rPr>
-        <w:t xml:space="preserve">допомогою дошки </w:t>
+        <w:t xml:space="preserve"> за допомогою дошки </w:t>
       </w:r>
       <w:proofErr w:type="spellStart"/>
       <w:r>
@@ -20838,12 +20781,11 @@
         </w:rPr>
         <w:t>.</w:t>
       </w:r>
-      <w:bookmarkEnd w:id="0"/>
     </w:p>
     <w:sectPr>
-      <w:footerReference w:type="default" r:id="rId36"/>
-      <w:headerReference w:type="first" r:id="rId37"/>
-      <w:footerReference w:type="first" r:id="rId38"/>
+      <w:footerReference w:type="default" r:id="rId38"/>
+      <w:headerReference w:type="first" r:id="rId39"/>
+      <w:footerReference w:type="first" r:id="rId40"/>
       <w:pgSz w:w="11909" w:h="16834"/>
       <w:pgMar w:top="1440" w:right="1440" w:bottom="1440" w:left="1440" w:header="720" w:footer="720" w:gutter="0"/>
       <w:pgNumType w:start="1"/>
@@ -24439,7 +24381,7 @@
 </file>
 
 <file path=customXml/itemProps1.xml><?xml version="1.0" encoding="utf-8"?>
-<ds:datastoreItem xmlns:ds="http://schemas.openxmlformats.org/officeDocument/2006/customXml" ds:itemID="{4BBE8570-011A-4AEF-822C-B27D026883BA}">
+<ds:datastoreItem xmlns:ds="http://schemas.openxmlformats.org/officeDocument/2006/customXml" ds:itemID="{40AB167C-039B-461F-AE1C-AA142DE2C54D}">
   <ds:schemaRefs>
     <ds:schemaRef ds:uri="http://schemas.openxmlformats.org/officeDocument/2006/bibliography"/>
   </ds:schemaRefs>

</xml_diff>

<commit_message>
docs(epic-1): small text fix
</commit_message>
<xml_diff>
--- a/ai_14/danylo_burban/epic_1/epic_1_report_danylo_burban.docx
+++ b/ai_14/danylo_burban/epic_1/epic_1_report_danylo_burban.docx
@@ -10,6 +10,7 @@
           <w:rFonts w:ascii="Times New Roman" w:eastAsia="Times New Roman" w:hAnsi="Times New Roman" w:cs="Times New Roman"/>
           <w:sz w:val="28"/>
           <w:szCs w:val="28"/>
+          <w:lang w:val="uk-UA"/>
         </w:rPr>
       </w:pPr>
       <w:r>
@@ -17,6 +18,7 @@
           <w:rFonts w:ascii="Times New Roman" w:eastAsia="Times New Roman" w:hAnsi="Times New Roman" w:cs="Times New Roman"/>
           <w:sz w:val="28"/>
           <w:szCs w:val="28"/>
+          <w:lang w:val="uk-UA"/>
         </w:rPr>
         <w:t>Міністерство освіти і науки України</w:t>
       </w:r>
@@ -29,6 +31,7 @@
           <w:rFonts w:ascii="Times New Roman" w:eastAsia="Times New Roman" w:hAnsi="Times New Roman" w:cs="Times New Roman"/>
           <w:sz w:val="28"/>
           <w:szCs w:val="28"/>
+          <w:lang w:val="uk-UA"/>
         </w:rPr>
       </w:pPr>
       <w:r>
@@ -36,6 +39,7 @@
           <w:rFonts w:ascii="Times New Roman" w:eastAsia="Times New Roman" w:hAnsi="Times New Roman" w:cs="Times New Roman"/>
           <w:sz w:val="28"/>
           <w:szCs w:val="28"/>
+          <w:lang w:val="uk-UA"/>
         </w:rPr>
         <w:t>Національний університет «Львівська політехніка»</w:t>
       </w:r>
@@ -48,6 +52,7 @@
           <w:rFonts w:ascii="Times New Roman" w:eastAsia="Times New Roman" w:hAnsi="Times New Roman" w:cs="Times New Roman"/>
           <w:sz w:val="28"/>
           <w:szCs w:val="28"/>
+          <w:lang w:val="uk-UA"/>
         </w:rPr>
       </w:pPr>
       <w:r>
@@ -55,6 +60,7 @@
           <w:rFonts w:ascii="Times New Roman" w:eastAsia="Times New Roman" w:hAnsi="Times New Roman" w:cs="Times New Roman"/>
           <w:sz w:val="28"/>
           <w:szCs w:val="28"/>
+          <w:lang w:val="uk-UA"/>
         </w:rPr>
         <w:t>Кафедра систем штучного інтелекту</w:t>
       </w:r>
@@ -66,6 +72,7 @@
           <w:rFonts w:ascii="Times New Roman" w:eastAsia="Times New Roman" w:hAnsi="Times New Roman" w:cs="Times New Roman"/>
           <w:sz w:val="24"/>
           <w:szCs w:val="24"/>
+          <w:lang w:val="uk-UA"/>
         </w:rPr>
       </w:pPr>
     </w:p>
@@ -76,6 +83,7 @@
           <w:rFonts w:ascii="Times New Roman" w:eastAsia="Times New Roman" w:hAnsi="Times New Roman" w:cs="Times New Roman"/>
           <w:sz w:val="24"/>
           <w:szCs w:val="24"/>
+          <w:lang w:val="uk-UA"/>
         </w:rPr>
       </w:pPr>
       <w:r>
@@ -136,6 +144,7 @@
           <w:rFonts w:ascii="Times New Roman" w:eastAsia="Times New Roman" w:hAnsi="Times New Roman" w:cs="Times New Roman"/>
           <w:sz w:val="24"/>
           <w:szCs w:val="24"/>
+          <w:lang w:val="uk-UA"/>
         </w:rPr>
       </w:pPr>
     </w:p>
@@ -147,6 +156,7 @@
           <w:rFonts w:ascii="Times New Roman" w:eastAsia="Times New Roman" w:hAnsi="Times New Roman" w:cs="Times New Roman"/>
           <w:sz w:val="24"/>
           <w:szCs w:val="24"/>
+          <w:lang w:val="uk-UA"/>
         </w:rPr>
       </w:pPr>
     </w:p>
@@ -158,6 +168,7 @@
           <w:rFonts w:ascii="Times New Roman" w:eastAsia="Times New Roman" w:hAnsi="Times New Roman" w:cs="Times New Roman"/>
           <w:sz w:val="24"/>
           <w:szCs w:val="24"/>
+          <w:lang w:val="uk-UA"/>
         </w:rPr>
       </w:pPr>
     </w:p>
@@ -169,6 +180,7 @@
           <w:rFonts w:ascii="Times New Roman" w:eastAsia="Times New Roman" w:hAnsi="Times New Roman" w:cs="Times New Roman"/>
           <w:sz w:val="24"/>
           <w:szCs w:val="24"/>
+          <w:lang w:val="uk-UA"/>
         </w:rPr>
       </w:pPr>
     </w:p>
@@ -180,6 +192,7 @@
           <w:rFonts w:ascii="Times New Roman" w:eastAsia="Times New Roman" w:hAnsi="Times New Roman" w:cs="Times New Roman"/>
           <w:sz w:val="24"/>
           <w:szCs w:val="24"/>
+          <w:lang w:val="uk-UA"/>
         </w:rPr>
       </w:pPr>
     </w:p>
@@ -193,6 +206,7 @@
           <w:bCs/>
           <w:sz w:val="40"/>
           <w:szCs w:val="40"/>
+          <w:lang w:val="uk-UA"/>
         </w:rPr>
       </w:pPr>
     </w:p>
@@ -206,6 +220,7 @@
           <w:bCs/>
           <w:sz w:val="40"/>
           <w:szCs w:val="40"/>
+          <w:lang w:val="uk-UA"/>
         </w:rPr>
       </w:pPr>
     </w:p>
@@ -219,6 +234,7 @@
           <w:bCs/>
           <w:sz w:val="40"/>
           <w:szCs w:val="40"/>
+          <w:lang w:val="uk-UA"/>
         </w:rPr>
       </w:pPr>
     </w:p>
@@ -232,6 +248,7 @@
           <w:bCs/>
           <w:sz w:val="40"/>
           <w:szCs w:val="40"/>
+          <w:lang w:val="uk-UA"/>
         </w:rPr>
       </w:pPr>
       <w:r>
@@ -241,6 +258,7 @@
           <w:bCs/>
           <w:sz w:val="40"/>
           <w:szCs w:val="40"/>
+          <w:lang w:val="uk-UA"/>
         </w:rPr>
         <w:t>Звіт</w:t>
       </w:r>
@@ -258,6 +276,7 @@
           <w:bCs/>
           <w:sz w:val="28"/>
           <w:szCs w:val="28"/>
+          <w:lang w:val="uk-UA"/>
         </w:rPr>
       </w:pPr>
       <w:r>
@@ -267,6 +286,7 @@
           <w:bCs/>
           <w:sz w:val="28"/>
           <w:szCs w:val="28"/>
+          <w:lang w:val="uk-UA"/>
         </w:rPr>
         <w:tab/>
       </w:r>
@@ -284,6 +304,7 @@
           <w:bCs/>
           <w:sz w:val="28"/>
           <w:szCs w:val="28"/>
+          <w:lang w:val="uk-UA"/>
         </w:rPr>
       </w:pPr>
     </w:p>
@@ -300,6 +321,7 @@
           <w:bCs/>
           <w:sz w:val="28"/>
           <w:szCs w:val="28"/>
+          <w:lang w:val="uk-UA"/>
         </w:rPr>
       </w:pPr>
     </w:p>
@@ -316,6 +338,7 @@
           <w:bCs/>
           <w:sz w:val="28"/>
           <w:szCs w:val="28"/>
+          <w:lang w:val="uk-UA"/>
         </w:rPr>
       </w:pPr>
     </w:p>
@@ -332,6 +355,7 @@
           <w:bCs/>
           <w:sz w:val="28"/>
           <w:szCs w:val="28"/>
+          <w:lang w:val="uk-UA"/>
         </w:rPr>
       </w:pPr>
     </w:p>
@@ -349,6 +373,7 @@
           <w:bCs/>
           <w:sz w:val="28"/>
           <w:szCs w:val="28"/>
+          <w:lang w:val="uk-UA"/>
         </w:rPr>
       </w:pPr>
       <w:r>
@@ -358,6 +383,7 @@
           <w:bCs/>
           <w:sz w:val="56"/>
           <w:szCs w:val="56"/>
+          <w:lang w:val="uk-UA"/>
         </w:rPr>
         <w:t>Звіт</w:t>
       </w:r>
@@ -368,6 +394,7 @@
           <w:bCs/>
           <w:sz w:val="28"/>
           <w:szCs w:val="28"/>
+          <w:lang w:val="uk-UA"/>
         </w:rPr>
         <w:t xml:space="preserve"> </w:t>
       </w:r>
@@ -386,6 +413,7 @@
           <w:bCs/>
           <w:sz w:val="28"/>
           <w:szCs w:val="28"/>
+          <w:lang w:val="uk-UA"/>
         </w:rPr>
       </w:pPr>
       <w:r>
@@ -395,6 +423,7 @@
           <w:bCs/>
           <w:sz w:val="28"/>
           <w:szCs w:val="28"/>
+          <w:lang w:val="uk-UA"/>
         </w:rPr>
         <w:t>про виконання лабораторних та практичних робіт блоку № 1</w:t>
       </w:r>
@@ -407,6 +436,7 @@
           <w:rFonts w:ascii="Times New Roman" w:eastAsia="Times New Roman" w:hAnsi="Times New Roman" w:cs="Times New Roman"/>
           <w:sz w:val="28"/>
           <w:szCs w:val="28"/>
+          <w:lang w:val="uk-UA"/>
         </w:rPr>
       </w:pPr>
       <w:r>
@@ -414,6 +444,7 @@
           <w:rFonts w:ascii="Times New Roman" w:eastAsia="Times New Roman" w:hAnsi="Times New Roman" w:cs="Times New Roman"/>
           <w:sz w:val="28"/>
           <w:szCs w:val="28"/>
+          <w:lang w:val="uk-UA"/>
         </w:rPr>
         <w:t>На тему:  «Розробка та середовище розробки. Програмування: алгоритм, програма, код.»</w:t>
       </w:r>
@@ -426,6 +457,7 @@
           <w:rFonts w:ascii="Times New Roman" w:eastAsia="Times New Roman" w:hAnsi="Times New Roman" w:cs="Times New Roman"/>
           <w:sz w:val="28"/>
           <w:szCs w:val="28"/>
+          <w:lang w:val="uk-UA"/>
         </w:rPr>
       </w:pPr>
       <w:r>
@@ -437,6 +469,7 @@
           <w:iCs/>
           <w:sz w:val="28"/>
           <w:szCs w:val="28"/>
+          <w:lang w:val="uk-UA"/>
         </w:rPr>
         <w:t xml:space="preserve">з дисципліни: </w:t>
       </w:r>
@@ -445,6 +478,7 @@
           <w:rFonts w:ascii="Times New Roman" w:eastAsia="Times New Roman" w:hAnsi="Times New Roman" w:cs="Times New Roman"/>
           <w:sz w:val="28"/>
           <w:szCs w:val="28"/>
+          <w:lang w:val="uk-UA"/>
         </w:rPr>
         <w:t>«Основи програмування»</w:t>
       </w:r>
@@ -457,6 +491,7 @@
           <w:rFonts w:ascii="Times New Roman" w:eastAsia="Times New Roman" w:hAnsi="Times New Roman" w:cs="Times New Roman"/>
           <w:sz w:val="28"/>
           <w:szCs w:val="28"/>
+          <w:lang w:val="uk-UA"/>
         </w:rPr>
       </w:pPr>
       <w:r>
@@ -464,6 +499,7 @@
           <w:rFonts w:ascii="Times New Roman" w:eastAsia="Times New Roman" w:hAnsi="Times New Roman" w:cs="Times New Roman"/>
           <w:sz w:val="28"/>
           <w:szCs w:val="28"/>
+          <w:lang w:val="uk-UA"/>
         </w:rPr>
         <w:t>до:</w:t>
       </w:r>
@@ -476,6 +512,7 @@
           <w:rFonts w:ascii="Times New Roman" w:eastAsia="Times New Roman" w:hAnsi="Times New Roman" w:cs="Times New Roman"/>
           <w:sz w:val="28"/>
           <w:szCs w:val="28"/>
+          <w:lang w:val="uk-UA"/>
         </w:rPr>
       </w:pPr>
       <w:r>
@@ -483,6 +520,7 @@
           <w:rFonts w:ascii="Times New Roman" w:eastAsia="Times New Roman" w:hAnsi="Times New Roman" w:cs="Times New Roman"/>
           <w:sz w:val="28"/>
           <w:szCs w:val="28"/>
+          <w:lang w:val="uk-UA"/>
         </w:rPr>
         <w:t>Практичних Робіт до блоку № 1</w:t>
       </w:r>
@@ -495,6 +533,7 @@
           <w:rFonts w:ascii="Times New Roman" w:eastAsia="Times New Roman" w:hAnsi="Times New Roman" w:cs="Times New Roman"/>
           <w:sz w:val="28"/>
           <w:szCs w:val="28"/>
+          <w:lang w:val="uk-UA"/>
         </w:rPr>
       </w:pPr>
     </w:p>
@@ -506,6 +545,7 @@
           <w:rFonts w:ascii="Times New Roman" w:eastAsia="Times New Roman" w:hAnsi="Times New Roman" w:cs="Times New Roman"/>
           <w:sz w:val="28"/>
           <w:szCs w:val="28"/>
+          <w:lang w:val="uk-UA"/>
         </w:rPr>
       </w:pPr>
     </w:p>
@@ -517,6 +557,7 @@
           <w:rFonts w:ascii="Times New Roman" w:eastAsia="Times New Roman" w:hAnsi="Times New Roman" w:cs="Times New Roman"/>
           <w:sz w:val="28"/>
           <w:szCs w:val="28"/>
+          <w:lang w:val="uk-UA"/>
         </w:rPr>
       </w:pPr>
     </w:p>
@@ -531,6 +572,7 @@
           <w:smallCaps/>
           <w:sz w:val="28"/>
           <w:szCs w:val="28"/>
+          <w:lang w:val="uk-UA"/>
         </w:rPr>
       </w:pPr>
     </w:p>
@@ -541,6 +583,7 @@
           <w:rFonts w:ascii="Times New Roman" w:eastAsia="Times New Roman" w:hAnsi="Times New Roman" w:cs="Times New Roman"/>
           <w:sz w:val="28"/>
           <w:szCs w:val="28"/>
+          <w:lang w:val="uk-UA"/>
         </w:rPr>
       </w:pPr>
     </w:p>
@@ -554,6 +597,7 @@
           <w:bCs/>
           <w:sz w:val="28"/>
           <w:szCs w:val="28"/>
+          <w:lang w:val="uk-UA"/>
         </w:rPr>
       </w:pPr>
       <w:r>
@@ -563,6 +607,7 @@
           <w:bCs/>
           <w:sz w:val="28"/>
           <w:szCs w:val="28"/>
+          <w:lang w:val="uk-UA"/>
         </w:rPr>
         <w:t>Виконав(ла):</w:t>
       </w:r>
@@ -579,6 +624,7 @@
           <w:iCs/>
           <w:sz w:val="28"/>
           <w:szCs w:val="28"/>
+          <w:lang w:val="uk-UA"/>
         </w:rPr>
       </w:pPr>
       <w:r>
@@ -590,6 +636,7 @@
           <w:iCs/>
           <w:sz w:val="28"/>
           <w:szCs w:val="28"/>
+          <w:lang w:val="uk-UA"/>
         </w:rPr>
         <w:t xml:space="preserve"> </w:t>
       </w:r>
@@ -598,6 +645,7 @@
           <w:rFonts w:ascii="Times New Roman" w:eastAsia="Times New Roman" w:hAnsi="Times New Roman" w:cs="Times New Roman"/>
           <w:sz w:val="28"/>
           <w:szCs w:val="28"/>
+          <w:lang w:val="uk-UA"/>
         </w:rPr>
         <w:t>Студент групи ШІ-14</w:t>
       </w:r>
@@ -644,6 +692,8 @@
           <w:lang w:val="uk-UA"/>
         </w:rPr>
       </w:pPr>
+      <w:bookmarkStart w:id="0" w:name="_GoBack"/>
+      <w:bookmarkEnd w:id="0"/>
     </w:p>
     <w:p>
       <w:pPr>
@@ -695,6 +745,7 @@
           <w:b/>
           <w:bCs/>
           <w:color w:val="000000"/>
+          <w:lang w:val="uk-UA"/>
         </w:rPr>
         <w:lastRenderedPageBreak/>
         <w:t xml:space="preserve">Тема роботи:  </w:t>
@@ -716,16 +767,7 @@
           <w:szCs w:val="24"/>
           <w:lang w:val="uk-UA"/>
         </w:rPr>
-        <w:t>Розробка та середовище розробки. Програмування: алгоритм, програма, код.</w:t>
-      </w:r>
-      <w:r>
-        <w:rPr>
-          <w:rFonts w:ascii="Times New Roman" w:hAnsi="Times New Roman" w:cs="Times New Roman"/>
-          <w:sz w:val="24"/>
-          <w:szCs w:val="24"/>
-          <w:lang w:val="uk-UA"/>
-        </w:rPr>
-        <w:t xml:space="preserve"> </w:t>
+        <w:t xml:space="preserve">Розробка та середовище розробки. Програмування: алгоритм, програма, код. </w:t>
       </w:r>
     </w:p>
     <w:p>
@@ -736,6 +778,7 @@
           <w:b/>
           <w:bCs/>
           <w:color w:val="000000"/>
+          <w:lang w:val="uk-UA"/>
         </w:rPr>
       </w:pPr>
       <w:r>
@@ -744,6 +787,7 @@
           <w:b/>
           <w:bCs/>
           <w:color w:val="000000"/>
+          <w:lang w:val="uk-UA"/>
         </w:rPr>
         <w:t xml:space="preserve">Мета роботи: </w:t>
       </w:r>
@@ -754,7 +798,7 @@
           <w:rFonts w:ascii="Times New Roman" w:hAnsi="Times New Roman" w:cs="Times New Roman"/>
           <w:sz w:val="24"/>
           <w:szCs w:val="24"/>
-          <w:lang w:val="ru-RU"/>
+          <w:lang w:val="uk-UA"/>
         </w:rPr>
       </w:pPr>
       <w:r>
@@ -764,25 +808,29 @@
           <w:szCs w:val="24"/>
           <w:lang w:val="uk-UA"/>
         </w:rPr>
-        <w:t xml:space="preserve">Ознайомитись й налаштувати технологію </w:t>
-      </w:r>
+        <w:t>Ознайомитись й налаштувати технологію WSL2/</w:t>
+      </w:r>
+      <w:proofErr w:type="spellStart"/>
       <w:r>
         <w:rPr>
           <w:rFonts w:ascii="Times New Roman" w:hAnsi="Times New Roman" w:cs="Times New Roman"/>
           <w:sz w:val="24"/>
           <w:szCs w:val="24"/>
-          <w:lang w:val="en-US"/>
-        </w:rPr>
-        <w:t>WSL</w:t>
-      </w:r>
+          <w:lang w:val="uk-UA"/>
+        </w:rPr>
+        <w:t>Ubuntu</w:t>
+      </w:r>
+      <w:proofErr w:type="spellEnd"/>
       <w:r>
         <w:rPr>
           <w:rFonts w:ascii="Times New Roman" w:hAnsi="Times New Roman" w:cs="Times New Roman"/>
           <w:sz w:val="24"/>
           <w:szCs w:val="24"/>
-        </w:rPr>
-        <w:t>2</w:t>
-      </w:r>
+          <w:lang w:val="uk-UA"/>
+        </w:rPr>
+        <w:t xml:space="preserve">  та середовище розробки </w:t>
+      </w:r>
+      <w:proofErr w:type="spellStart"/>
       <w:r>
         <w:rPr>
           <w:rFonts w:ascii="Times New Roman" w:hAnsi="Times New Roman" w:cs="Times New Roman"/>
@@ -790,25 +838,29 @@
           <w:szCs w:val="24"/>
           <w:lang w:val="uk-UA"/>
         </w:rPr>
-        <w:t>/</w:t>
-      </w:r>
+        <w:t>Visual</w:t>
+      </w:r>
+      <w:proofErr w:type="spellEnd"/>
       <w:r>
         <w:rPr>
           <w:rFonts w:ascii="Times New Roman" w:hAnsi="Times New Roman" w:cs="Times New Roman"/>
           <w:sz w:val="24"/>
           <w:szCs w:val="24"/>
-          <w:lang w:val="en-US"/>
-        </w:rPr>
-        <w:t>Ubuntu</w:t>
-      </w:r>
+          <w:lang w:val="uk-UA"/>
+        </w:rPr>
+        <w:t xml:space="preserve"> </w:t>
+      </w:r>
+      <w:proofErr w:type="spellStart"/>
       <w:r>
         <w:rPr>
           <w:rFonts w:ascii="Times New Roman" w:hAnsi="Times New Roman" w:cs="Times New Roman"/>
           <w:sz w:val="24"/>
           <w:szCs w:val="24"/>
-        </w:rPr>
-        <w:t xml:space="preserve"> </w:t>
-      </w:r>
+          <w:lang w:val="uk-UA"/>
+        </w:rPr>
+        <w:t>Studio</w:t>
+      </w:r>
+      <w:proofErr w:type="spellEnd"/>
       <w:r>
         <w:rPr>
           <w:rFonts w:ascii="Times New Roman" w:hAnsi="Times New Roman" w:cs="Times New Roman"/>
@@ -816,59 +868,68 @@
           <w:szCs w:val="24"/>
           <w:lang w:val="uk-UA"/>
         </w:rPr>
-        <w:t xml:space="preserve"> та середовище розробки </w:t>
-      </w:r>
+        <w:t xml:space="preserve"> </w:t>
+      </w:r>
+      <w:proofErr w:type="spellStart"/>
       <w:r>
         <w:rPr>
           <w:rFonts w:ascii="Times New Roman" w:hAnsi="Times New Roman" w:cs="Times New Roman"/>
           <w:sz w:val="24"/>
           <w:szCs w:val="24"/>
-          <w:lang w:val="en-US"/>
-        </w:rPr>
-        <w:t>Visual</w:t>
-      </w:r>
+          <w:lang w:val="uk-UA"/>
+        </w:rPr>
+        <w:t>Code</w:t>
+      </w:r>
+      <w:proofErr w:type="spellEnd"/>
       <w:r>
         <w:rPr>
           <w:rFonts w:ascii="Times New Roman" w:hAnsi="Times New Roman" w:cs="Times New Roman"/>
           <w:sz w:val="24"/>
           <w:szCs w:val="24"/>
-        </w:rPr>
-        <w:t xml:space="preserve"> </w:t>
+          <w:lang w:val="uk-UA"/>
+        </w:rPr>
+        <w:t xml:space="preserve">. </w:t>
       </w:r>
       <w:r>
         <w:rPr>
           <w:rFonts w:ascii="Times New Roman" w:hAnsi="Times New Roman" w:cs="Times New Roman"/>
           <w:sz w:val="24"/>
           <w:szCs w:val="24"/>
-          <w:lang w:val="en-US"/>
-        </w:rPr>
-        <w:t>Studio</w:t>
-      </w:r>
+          <w:lang w:val="uk-UA"/>
+        </w:rPr>
+        <w:t>Освоїти базовий синтаксис, можливості С++ та основні інструменти для роботи з ним (</w:t>
+      </w:r>
+      <w:proofErr w:type="spellStart"/>
       <w:r>
         <w:rPr>
           <w:rFonts w:ascii="Times New Roman" w:hAnsi="Times New Roman" w:cs="Times New Roman"/>
           <w:sz w:val="24"/>
           <w:szCs w:val="24"/>
-        </w:rPr>
-        <w:t xml:space="preserve"> </w:t>
-      </w:r>
+          <w:lang w:val="uk-UA"/>
+        </w:rPr>
+        <w:t>дебагер</w:t>
+      </w:r>
+      <w:proofErr w:type="spellEnd"/>
       <w:r>
         <w:rPr>
           <w:rFonts w:ascii="Times New Roman" w:hAnsi="Times New Roman" w:cs="Times New Roman"/>
           <w:sz w:val="24"/>
           <w:szCs w:val="24"/>
-          <w:lang w:val="en-US"/>
-        </w:rPr>
-        <w:t>Code</w:t>
-      </w:r>
+          <w:lang w:val="uk-UA"/>
+        </w:rPr>
+        <w:t xml:space="preserve">, </w:t>
+      </w:r>
+      <w:proofErr w:type="spellStart"/>
       <w:r>
         <w:rPr>
           <w:rFonts w:ascii="Times New Roman" w:hAnsi="Times New Roman" w:cs="Times New Roman"/>
           <w:sz w:val="24"/>
           <w:szCs w:val="24"/>
-        </w:rPr>
-        <w:t xml:space="preserve">. </w:t>
-      </w:r>
+          <w:lang w:val="uk-UA"/>
+        </w:rPr>
+        <w:t>лінтер</w:t>
+      </w:r>
+      <w:proofErr w:type="spellEnd"/>
       <w:r>
         <w:rPr>
           <w:rFonts w:ascii="Times New Roman" w:hAnsi="Times New Roman" w:cs="Times New Roman"/>
@@ -876,9 +937,8 @@
           <w:szCs w:val="24"/>
           <w:lang w:val="uk-UA"/>
         </w:rPr>
-        <w:t>Освоїти базовий синтаксис, можливості С++ та основні інструменти для роботи з ним (</w:t>
-      </w:r>
-      <w:proofErr w:type="spellStart"/>
+        <w:t>). Навчитись користуватись системо</w:t>
+      </w:r>
       <w:r>
         <w:rPr>
           <w:rFonts w:ascii="Times New Roman" w:hAnsi="Times New Roman" w:cs="Times New Roman"/>
@@ -886,9 +946,8 @@
           <w:szCs w:val="24"/>
           <w:lang w:val="uk-UA"/>
         </w:rPr>
-        <w:t>дебагер</w:t>
-      </w:r>
-      <w:proofErr w:type="spellEnd"/>
+        <w:t>ю к</w:t>
+      </w:r>
       <w:r>
         <w:rPr>
           <w:rFonts w:ascii="Times New Roman" w:hAnsi="Times New Roman" w:cs="Times New Roman"/>
@@ -896,7 +955,7 @@
           <w:szCs w:val="24"/>
           <w:lang w:val="uk-UA"/>
         </w:rPr>
-        <w:t xml:space="preserve">, </w:t>
+        <w:t xml:space="preserve">онтролю версій </w:t>
       </w:r>
       <w:proofErr w:type="spellStart"/>
       <w:r>
@@ -906,7 +965,7 @@
           <w:szCs w:val="24"/>
           <w:lang w:val="uk-UA"/>
         </w:rPr>
-        <w:t>лінтер</w:t>
+        <w:t>Git</w:t>
       </w:r>
       <w:proofErr w:type="spellEnd"/>
       <w:r>
@@ -916,9 +975,8 @@
           <w:szCs w:val="24"/>
           <w:lang w:val="uk-UA"/>
         </w:rPr>
-        <w:t xml:space="preserve">). Навчитись користуватись системою </w:t>
-      </w:r>
-      <w:proofErr w:type="spellStart"/>
+        <w:t xml:space="preserve"> </w:t>
+      </w:r>
       <w:r>
         <w:rPr>
           <w:rFonts w:ascii="Times New Roman" w:hAnsi="Times New Roman" w:cs="Times New Roman"/>
@@ -926,9 +984,8 @@
           <w:szCs w:val="24"/>
           <w:lang w:val="uk-UA"/>
         </w:rPr>
-        <w:t>еонтролю</w:t>
-      </w:r>
-      <w:proofErr w:type="spellEnd"/>
+        <w:t>та дошкою завда</w:t>
+      </w:r>
       <w:r>
         <w:rPr>
           <w:rFonts w:ascii="Times New Roman" w:hAnsi="Times New Roman" w:cs="Times New Roman"/>
@@ -936,7 +993,7 @@
           <w:szCs w:val="24"/>
           <w:lang w:val="uk-UA"/>
         </w:rPr>
-        <w:t xml:space="preserve"> версій </w:t>
+        <w:t xml:space="preserve">нь </w:t>
       </w:r>
       <w:proofErr w:type="spellStart"/>
       <w:r>
@@ -944,9 +1001,9 @@
           <w:rFonts w:ascii="Times New Roman" w:hAnsi="Times New Roman" w:cs="Times New Roman"/>
           <w:sz w:val="24"/>
           <w:szCs w:val="24"/>
-          <w:lang w:val="en-US"/>
-        </w:rPr>
-        <w:t>Git</w:t>
+          <w:lang w:val="uk-UA"/>
+        </w:rPr>
+        <w:t>Trello</w:t>
       </w:r>
       <w:proofErr w:type="spellEnd"/>
       <w:r>
@@ -954,10 +1011,11 @@
           <w:rFonts w:ascii="Times New Roman" w:hAnsi="Times New Roman" w:cs="Times New Roman"/>
           <w:sz w:val="24"/>
           <w:szCs w:val="24"/>
-          <w:lang w:val="ru-RU"/>
-        </w:rPr>
-        <w:t xml:space="preserve"> </w:t>
-      </w:r>
+          <w:lang w:val="uk-UA"/>
+        </w:rPr>
+        <w:t xml:space="preserve">. Ознайомитись і виконати завдання на платформі </w:t>
+      </w:r>
+      <w:proofErr w:type="spellStart"/>
       <w:r>
         <w:rPr>
           <w:rFonts w:ascii="Times New Roman" w:hAnsi="Times New Roman" w:cs="Times New Roman"/>
@@ -965,9 +1023,9 @@
           <w:szCs w:val="24"/>
           <w:lang w:val="uk-UA"/>
         </w:rPr>
-        <w:t xml:space="preserve">та дошкою </w:t>
-      </w:r>
-      <w:proofErr w:type="spellStart"/>
+        <w:t>Algotester</w:t>
+      </w:r>
+      <w:proofErr w:type="spellEnd"/>
       <w:r>
         <w:rPr>
           <w:rFonts w:ascii="Times New Roman" w:hAnsi="Times New Roman" w:cs="Times New Roman"/>
@@ -975,81 +1033,15 @@
           <w:szCs w:val="24"/>
           <w:lang w:val="uk-UA"/>
         </w:rPr>
-        <w:t>завданнь</w:t>
-      </w:r>
-      <w:proofErr w:type="spellEnd"/>
+        <w:t xml:space="preserve">. Навчитись будувати блок-схеми за допомогою </w:t>
+      </w:r>
+      <w:proofErr w:type="spellStart"/>
       <w:r>
         <w:rPr>
           <w:rFonts w:ascii="Times New Roman" w:hAnsi="Times New Roman" w:cs="Times New Roman"/>
           <w:sz w:val="24"/>
           <w:szCs w:val="24"/>
           <w:lang w:val="uk-UA"/>
-        </w:rPr>
-        <w:t xml:space="preserve"> </w:t>
-      </w:r>
-      <w:r>
-        <w:rPr>
-          <w:rFonts w:ascii="Times New Roman" w:hAnsi="Times New Roman" w:cs="Times New Roman"/>
-          <w:sz w:val="24"/>
-          <w:szCs w:val="24"/>
-          <w:lang w:val="en-US"/>
-        </w:rPr>
-        <w:t>Trello</w:t>
-      </w:r>
-      <w:r>
-        <w:rPr>
-          <w:rFonts w:ascii="Times New Roman" w:hAnsi="Times New Roman" w:cs="Times New Roman"/>
-          <w:sz w:val="24"/>
-          <w:szCs w:val="24"/>
-          <w:lang w:val="ru-RU"/>
-        </w:rPr>
-        <w:t xml:space="preserve">. </w:t>
-      </w:r>
-      <w:r>
-        <w:rPr>
-          <w:rFonts w:ascii="Times New Roman" w:hAnsi="Times New Roman" w:cs="Times New Roman"/>
-          <w:sz w:val="24"/>
-          <w:szCs w:val="24"/>
-          <w:lang w:val="uk-UA"/>
-        </w:rPr>
-        <w:t xml:space="preserve">Ознайомитись і виконати завдання на платформі </w:t>
-      </w:r>
-      <w:proofErr w:type="spellStart"/>
-      <w:r>
-        <w:rPr>
-          <w:rFonts w:ascii="Times New Roman" w:hAnsi="Times New Roman" w:cs="Times New Roman"/>
-          <w:sz w:val="24"/>
-          <w:szCs w:val="24"/>
-          <w:lang w:val="en-US"/>
-        </w:rPr>
-        <w:t>Algotester</w:t>
-      </w:r>
-      <w:proofErr w:type="spellEnd"/>
-      <w:r>
-        <w:rPr>
-          <w:rFonts w:ascii="Times New Roman" w:hAnsi="Times New Roman" w:cs="Times New Roman"/>
-          <w:sz w:val="24"/>
-          <w:szCs w:val="24"/>
-          <w:lang w:val="ru-RU"/>
-        </w:rPr>
-        <w:t xml:space="preserve">. </w:t>
-      </w:r>
-      <w:r>
-        <w:rPr>
-          <w:rFonts w:ascii="Times New Roman" w:hAnsi="Times New Roman" w:cs="Times New Roman"/>
-          <w:sz w:val="24"/>
-          <w:szCs w:val="24"/>
-          <w:lang w:val="uk-UA"/>
-        </w:rPr>
-        <w:t xml:space="preserve">Навчитись будувати блок-схеми за допомогою </w:t>
-      </w:r>
-      <w:proofErr w:type="spellStart"/>
-      <w:r>
-        <w:rPr>
-          <w:rFonts w:ascii="Times New Roman" w:hAnsi="Times New Roman" w:cs="Times New Roman"/>
-          <w:sz w:val="24"/>
-          <w:szCs w:val="24"/>
-          <w:lang w:val="en-US"/>
         </w:rPr>
         <w:t>Drawio</w:t>
       </w:r>
@@ -1069,12 +1061,16 @@
       <w:pPr>
         <w:pStyle w:val="1"/>
         <w:spacing w:before="240" w:after="0"/>
+        <w:rPr>
+          <w:lang w:val="uk-UA"/>
+        </w:rPr>
       </w:pPr>
       <w:r>
         <w:rPr>
           <w:color w:val="000000"/>
           <w:sz w:val="32"/>
           <w:szCs w:val="32"/>
+          <w:lang w:val="uk-UA"/>
         </w:rPr>
         <w:t>Теоретичні відомості:</w:t>
       </w:r>
@@ -1178,39 +1174,42 @@
         </w:rPr>
         <w:t xml:space="preserve"> Середовище розробки </w:t>
       </w:r>
-      <w:r>
-        <w:rPr>
-          <w:color w:val="000000"/>
-          <w:lang w:val="en-US"/>
+      <w:proofErr w:type="spellStart"/>
+      <w:r>
+        <w:rPr>
+          <w:color w:val="000000"/>
         </w:rPr>
         <w:t>Visual</w:t>
       </w:r>
-      <w:r>
-        <w:rPr>
-          <w:color w:val="000000"/>
-        </w:rPr>
-        <w:t xml:space="preserve"> </w:t>
-      </w:r>
-      <w:r>
-        <w:rPr>
-          <w:color w:val="000000"/>
-          <w:lang w:val="en-US"/>
+      <w:proofErr w:type="spellEnd"/>
+      <w:r>
+        <w:rPr>
+          <w:color w:val="000000"/>
+        </w:rPr>
+        <w:t xml:space="preserve"> </w:t>
+      </w:r>
+      <w:proofErr w:type="spellStart"/>
+      <w:r>
+        <w:rPr>
+          <w:color w:val="000000"/>
         </w:rPr>
         <w:t>Studio</w:t>
       </w:r>
-      <w:r>
-        <w:rPr>
-          <w:color w:val="000000"/>
-        </w:rPr>
-        <w:t xml:space="preserve"> </w:t>
-      </w:r>
-      <w:r>
-        <w:rPr>
-          <w:color w:val="000000"/>
-          <w:lang w:val="en-US"/>
+      <w:proofErr w:type="spellEnd"/>
+      <w:r>
+        <w:rPr>
+          <w:color w:val="000000"/>
+        </w:rPr>
+        <w:t xml:space="preserve"> </w:t>
+      </w:r>
+      <w:proofErr w:type="spellStart"/>
+      <w:r>
+        <w:rPr>
+          <w:color w:val="000000"/>
         </w:rPr>
         <w:t>Code</w:t>
       </w:r>
+      <w:proofErr w:type="spellEnd"/>
     </w:p>
     <w:p>
       <w:pPr>
@@ -1230,20 +1229,7 @@
         <w:rPr>
           <w:color w:val="000000"/>
         </w:rPr>
-        <w:t xml:space="preserve">Тема №3: </w:t>
-      </w:r>
-      <w:r>
-        <w:rPr>
-          <w:color w:val="000000"/>
-        </w:rPr>
-        <w:t xml:space="preserve">Основи </w:t>
-      </w:r>
-      <w:r>
-        <w:rPr>
-          <w:color w:val="000000"/>
-          <w:lang w:val="en-US"/>
-        </w:rPr>
-        <w:t>C++</w:t>
+        <w:t>Тема №3: Основи C++</w:t>
       </w:r>
     </w:p>
     <w:p>
@@ -1264,14 +1250,7 @@
         <w:rPr>
           <w:color w:val="000000"/>
         </w:rPr>
-        <w:t>Тема №</w:t>
-      </w:r>
-      <w:r>
-        <w:rPr>
-          <w:color w:val="000000"/>
-          <w:lang w:val="en-US"/>
-        </w:rPr>
-        <w:t>4</w:t>
+        <w:t>Тема №4</w:t>
       </w:r>
       <w:r>
         <w:rPr>
@@ -1283,7 +1262,6 @@
       <w:r>
         <w:rPr>
           <w:color w:val="000000"/>
-          <w:lang w:val="en-US"/>
         </w:rPr>
         <w:t>Git</w:t>
       </w:r>
@@ -1291,10 +1269,17 @@
       <w:r>
         <w:rPr>
           <w:color w:val="000000"/>
-          <w:lang w:val="en-US"/>
-        </w:rPr>
-        <w:t>/GitHub</w:t>
-      </w:r>
+        </w:rPr>
+        <w:t>/</w:t>
+      </w:r>
+      <w:proofErr w:type="spellStart"/>
+      <w:r>
+        <w:rPr>
+          <w:color w:val="000000"/>
+        </w:rPr>
+        <w:t>GitHub</w:t>
+      </w:r>
+      <w:proofErr w:type="spellEnd"/>
     </w:p>
     <w:p>
       <w:pPr>
@@ -1325,33 +1310,17 @@
       <w:r>
         <w:rPr>
           <w:color w:val="000000"/>
-          <w:lang w:val="ru-RU"/>
-        </w:rPr>
-        <w:t xml:space="preserve">: </w:t>
-      </w:r>
-      <w:proofErr w:type="spellStart"/>
-      <w:r>
-        <w:rPr>
-          <w:color w:val="000000"/>
-          <w:lang w:val="ru-RU"/>
-        </w:rPr>
-        <w:t>Дошка</w:t>
-      </w:r>
-      <w:proofErr w:type="spellEnd"/>
-      <w:r>
-        <w:rPr>
-          <w:color w:val="000000"/>
-          <w:lang w:val="ru-RU"/>
-        </w:rPr>
-        <w:t xml:space="preserve"> </w:t>
-      </w:r>
-      <w:r>
-        <w:rPr>
-          <w:color w:val="000000"/>
-          <w:lang w:val="en-US"/>
+        </w:rPr>
+        <w:t xml:space="preserve">: Дошка </w:t>
+      </w:r>
+      <w:proofErr w:type="spellStart"/>
+      <w:r>
+        <w:rPr>
+          <w:color w:val="000000"/>
         </w:rPr>
         <w:t>Trello</w:t>
       </w:r>
+      <w:proofErr w:type="spellEnd"/>
     </w:p>
     <w:p>
       <w:pPr>
@@ -1379,19 +1348,12 @@
         </w:rPr>
         <w:t xml:space="preserve">: </w:t>
       </w:r>
-      <w:r>
-        <w:rPr>
-          <w:color w:val="000000"/>
-          <w:lang w:val="en-US"/>
-        </w:rPr>
-        <w:t>Draw</w:t>
-      </w:r>
-      <w:proofErr w:type="spellStart"/>
-      <w:r>
-        <w:rPr>
-          <w:color w:val="000000"/>
-        </w:rPr>
-        <w:t>io</w:t>
+      <w:proofErr w:type="spellStart"/>
+      <w:r>
+        <w:rPr>
+          <w:color w:val="000000"/>
+        </w:rPr>
+        <w:t>Drawio</w:t>
       </w:r>
       <w:proofErr w:type="spellEnd"/>
     </w:p>
@@ -1452,9 +1414,13 @@
       <w:pPr>
         <w:rPr>
           <w:rFonts w:ascii="Times New Roman" w:hAnsi="Times New Roman" w:cs="Times New Roman"/>
-        </w:rPr>
-      </w:pPr>
-      <w:r>
+          <w:lang w:val="uk-UA"/>
+        </w:rPr>
+      </w:pPr>
+      <w:r>
+        <w:rPr>
+          <w:lang w:val="uk-UA"/>
+        </w:rPr>
         <w:br/>
       </w:r>
     </w:p>
@@ -1588,12 +1554,47 @@
         </w:rPr>
       </w:pPr>
       <w:hyperlink r:id="rId10" w:history="1">
+        <w:proofErr w:type="spellStart"/>
         <w:r>
           <w:rPr>
             <w:rStyle w:val="a6"/>
-            <w:lang w:val="en-US"/>
           </w:rPr>
-          <w:t>Install Ubuntu on WSL 2</w:t>
+          <w:t>Install</w:t>
+        </w:r>
+        <w:proofErr w:type="spellEnd"/>
+        <w:r>
+          <w:rPr>
+            <w:rStyle w:val="a6"/>
+          </w:rPr>
+          <w:t xml:space="preserve"> </w:t>
+        </w:r>
+        <w:proofErr w:type="spellStart"/>
+        <w:r>
+          <w:rPr>
+            <w:rStyle w:val="a6"/>
+          </w:rPr>
+          <w:t>Ubuntu</w:t>
+        </w:r>
+        <w:proofErr w:type="spellEnd"/>
+        <w:r>
+          <w:rPr>
+            <w:rStyle w:val="a6"/>
+          </w:rPr>
+          <w:t xml:space="preserve"> </w:t>
+        </w:r>
+        <w:proofErr w:type="spellStart"/>
+        <w:r>
+          <w:rPr>
+            <w:rStyle w:val="a6"/>
+          </w:rPr>
+          <w:t>on</w:t>
+        </w:r>
+        <w:proofErr w:type="spellEnd"/>
+        <w:r>
+          <w:rPr>
+            <w:rStyle w:val="a6"/>
+          </w:rPr>
+          <w:t xml:space="preserve"> WSL 2</w:t>
         </w:r>
       </w:hyperlink>
     </w:p>
@@ -1688,81 +1689,20 @@
         </w:rPr>
         <w:t xml:space="preserve">Установив </w:t>
       </w:r>
-      <w:r>
-        <w:rPr>
-          <w:color w:val="000000"/>
-          <w:lang w:val="en-US"/>
+      <w:proofErr w:type="spellStart"/>
+      <w:r>
+        <w:rPr>
+          <w:color w:val="000000"/>
         </w:rPr>
         <w:t>Ubuntu</w:t>
       </w:r>
-      <w:r>
-        <w:rPr>
-          <w:color w:val="000000"/>
-          <w:lang w:val="ru-RU"/>
-        </w:rPr>
-        <w:t xml:space="preserve"> </w:t>
-      </w:r>
-      <w:r>
-        <w:rPr>
-          <w:color w:val="000000"/>
-        </w:rPr>
-        <w:t xml:space="preserve">на </w:t>
-      </w:r>
-      <w:r>
-        <w:rPr>
-          <w:color w:val="000000"/>
-          <w:lang w:val="en-US"/>
-        </w:rPr>
-        <w:t>WSL</w:t>
-      </w:r>
-      <w:r>
-        <w:rPr>
-          <w:color w:val="000000"/>
-          <w:lang w:val="ru-RU"/>
-        </w:rPr>
-        <w:t xml:space="preserve">2 за </w:t>
-      </w:r>
-      <w:proofErr w:type="spellStart"/>
-      <w:r>
-        <w:rPr>
-          <w:color w:val="000000"/>
-          <w:lang w:val="ru-RU"/>
-        </w:rPr>
-        <w:t>допомогою</w:t>
-      </w:r>
-      <w:proofErr w:type="spellEnd"/>
-      <w:r>
-        <w:rPr>
-          <w:color w:val="000000"/>
-          <w:lang w:val="ru-RU"/>
-        </w:rPr>
-        <w:t xml:space="preserve"> </w:t>
-      </w:r>
-      <w:proofErr w:type="spellStart"/>
-      <w:r>
-        <w:rPr>
-          <w:color w:val="000000"/>
-          <w:lang w:val="ru-RU"/>
-        </w:rPr>
-        <w:t>інформації</w:t>
-      </w:r>
-      <w:proofErr w:type="spellEnd"/>
-      <w:r>
-        <w:rPr>
-          <w:color w:val="000000"/>
-          <w:lang w:val="ru-RU"/>
-        </w:rPr>
-        <w:t xml:space="preserve"> з </w:t>
-      </w:r>
-      <w:proofErr w:type="spellStart"/>
-      <w:r>
-        <w:rPr>
-          <w:color w:val="000000"/>
-          <w:lang w:val="ru-RU"/>
-        </w:rPr>
-        <w:t>посилання</w:t>
-      </w:r>
-      <w:proofErr w:type="spellEnd"/>
+      <w:proofErr w:type="spellEnd"/>
+      <w:r>
+        <w:rPr>
+          <w:color w:val="000000"/>
+        </w:rPr>
+        <w:t xml:space="preserve"> на WSL2 за допомогою інформації з посилання</w:t>
+      </w:r>
     </w:p>
     <w:p>
       <w:pPr>
@@ -1787,7 +1727,6 @@
       <w:r>
         <w:rPr>
           <w:color w:val="000000"/>
-          <w:lang w:val="en-US"/>
         </w:rPr>
         <w:t>linux</w:t>
       </w:r>
@@ -1795,15 +1734,8 @@
       <w:r>
         <w:rPr>
           <w:color w:val="000000"/>
-          <w:lang w:val="ru-RU"/>
-        </w:rPr>
-        <w:t xml:space="preserve"> </w:t>
-      </w:r>
-      <w:r>
-        <w:rPr>
-          <w:color w:val="000000"/>
-        </w:rPr>
-        <w:t>та застосував їх на практиці</w:t>
+        </w:rPr>
+        <w:t xml:space="preserve"> та застосував їх на практиці</w:t>
       </w:r>
     </w:p>
     <w:p>
@@ -1921,39 +1853,42 @@
         </w:rPr>
         <w:t xml:space="preserve">Середовище розробки </w:t>
       </w:r>
-      <w:r>
-        <w:rPr>
-          <w:color w:val="000000"/>
-          <w:lang w:val="en-US"/>
+      <w:proofErr w:type="spellStart"/>
+      <w:r>
+        <w:rPr>
+          <w:color w:val="000000"/>
         </w:rPr>
         <w:t>Visual</w:t>
       </w:r>
-      <w:r>
-        <w:rPr>
-          <w:color w:val="000000"/>
-        </w:rPr>
-        <w:t xml:space="preserve"> </w:t>
-      </w:r>
-      <w:r>
-        <w:rPr>
-          <w:color w:val="000000"/>
-          <w:lang w:val="en-US"/>
+      <w:proofErr w:type="spellEnd"/>
+      <w:r>
+        <w:rPr>
+          <w:color w:val="000000"/>
+        </w:rPr>
+        <w:t xml:space="preserve"> </w:t>
+      </w:r>
+      <w:proofErr w:type="spellStart"/>
+      <w:r>
+        <w:rPr>
+          <w:color w:val="000000"/>
         </w:rPr>
         <w:t>Studio</w:t>
       </w:r>
-      <w:r>
-        <w:rPr>
-          <w:color w:val="000000"/>
-        </w:rPr>
-        <w:t xml:space="preserve"> </w:t>
-      </w:r>
-      <w:r>
-        <w:rPr>
-          <w:color w:val="000000"/>
-          <w:lang w:val="en-US"/>
+      <w:proofErr w:type="spellEnd"/>
+      <w:r>
+        <w:rPr>
+          <w:color w:val="000000"/>
+        </w:rPr>
+        <w:t xml:space="preserve"> </w:t>
+      </w:r>
+      <w:proofErr w:type="spellStart"/>
+      <w:r>
+        <w:rPr>
+          <w:color w:val="000000"/>
         </w:rPr>
         <w:t>Code</w:t>
       </w:r>
+      <w:proofErr w:type="spellEnd"/>
     </w:p>
     <w:p>
       <w:pPr>
@@ -2064,6 +1999,7 @@
           <w:color w:val="000000"/>
           <w:sz w:val="24"/>
           <w:szCs w:val="24"/>
+          <w:lang w:val="uk-UA"/>
         </w:rPr>
       </w:pPr>
       <w:r>
@@ -2074,68 +2010,42 @@
           <w:szCs w:val="24"/>
           <w:lang w:val="uk-UA"/>
         </w:rPr>
-        <w:t xml:space="preserve">Налаштовано </w:t>
-      </w:r>
+        <w:t xml:space="preserve">Налаштовано VS </w:t>
+      </w:r>
+      <w:proofErr w:type="spellStart"/>
       <w:r>
         <w:rPr>
           <w:rFonts w:ascii="Times New Roman" w:hAnsi="Times New Roman" w:cs="Times New Roman"/>
           <w:color w:val="000000"/>
           <w:sz w:val="24"/>
           <w:szCs w:val="24"/>
-          <w:lang w:val="en-US"/>
-        </w:rPr>
-        <w:t>VS</w:t>
-      </w:r>
+          <w:lang w:val="uk-UA"/>
+        </w:rPr>
+        <w:t>code</w:t>
+      </w:r>
+      <w:proofErr w:type="spellEnd"/>
       <w:r>
         <w:rPr>
           <w:rFonts w:ascii="Times New Roman" w:hAnsi="Times New Roman" w:cs="Times New Roman"/>
           <w:color w:val="000000"/>
           <w:sz w:val="24"/>
           <w:szCs w:val="24"/>
-          <w:lang w:val="ru-RU"/>
-        </w:rPr>
-        <w:t xml:space="preserve"> </w:t>
-      </w:r>
+          <w:lang w:val="uk-UA"/>
+        </w:rPr>
+        <w:t xml:space="preserve"> та </w:t>
+      </w:r>
+      <w:proofErr w:type="spellStart"/>
       <w:r>
         <w:rPr>
           <w:rFonts w:ascii="Times New Roman" w:hAnsi="Times New Roman" w:cs="Times New Roman"/>
           <w:color w:val="000000"/>
           <w:sz w:val="24"/>
           <w:szCs w:val="24"/>
-          <w:lang w:val="en-US"/>
-        </w:rPr>
-        <w:t>code</w:t>
-      </w:r>
-      <w:r>
-        <w:rPr>
-          <w:rFonts w:ascii="Times New Roman" w:hAnsi="Times New Roman" w:cs="Times New Roman"/>
-          <w:color w:val="000000"/>
-          <w:sz w:val="24"/>
-          <w:szCs w:val="24"/>
-          <w:lang w:val="uk-UA"/>
-        </w:rPr>
-        <w:t xml:space="preserve"> та</w:t>
-      </w:r>
-      <w:r>
-        <w:rPr>
-          <w:rFonts w:ascii="Times New Roman" w:hAnsi="Times New Roman" w:cs="Times New Roman"/>
-          <w:color w:val="000000"/>
-          <w:sz w:val="24"/>
-          <w:szCs w:val="24"/>
-          <w:lang w:val="ru-RU"/>
-        </w:rPr>
-        <w:t xml:space="preserve"> </w:t>
-      </w:r>
-      <w:r>
-        <w:rPr>
-          <w:rFonts w:ascii="Times New Roman" w:hAnsi="Times New Roman" w:cs="Times New Roman"/>
-          <w:color w:val="000000"/>
-          <w:sz w:val="24"/>
-          <w:szCs w:val="24"/>
-          <w:lang w:val="en-US"/>
+          <w:lang w:val="uk-UA"/>
         </w:rPr>
         <w:t>extensions</w:t>
       </w:r>
+      <w:proofErr w:type="spellEnd"/>
       <w:r>
         <w:rPr>
           <w:rFonts w:ascii="Times New Roman" w:hAnsi="Times New Roman" w:cs="Times New Roman"/>
@@ -2261,14 +2171,7 @@
         <w:rPr>
           <w:color w:val="000000"/>
         </w:rPr>
-        <w:t xml:space="preserve">Основи </w:t>
-      </w:r>
-      <w:r>
-        <w:rPr>
-          <w:color w:val="000000"/>
-          <w:lang w:val="en-US"/>
-        </w:rPr>
-        <w:t>C++</w:t>
+        <w:t>Основи C++</w:t>
       </w:r>
     </w:p>
     <w:p>
@@ -2354,6 +2257,7 @@
           <w:color w:val="000000"/>
           <w:sz w:val="24"/>
           <w:szCs w:val="24"/>
+          <w:lang w:val="uk-UA"/>
         </w:rPr>
       </w:pPr>
       <w:r>
@@ -2484,7 +2388,6 @@
       <w:r>
         <w:rPr>
           <w:color w:val="000000"/>
-          <w:lang w:val="en-US"/>
         </w:rPr>
         <w:t>Git</w:t>
       </w:r>
@@ -2492,10 +2395,17 @@
       <w:r>
         <w:rPr>
           <w:color w:val="000000"/>
-          <w:lang w:val="en-US"/>
-        </w:rPr>
-        <w:t>/GitHub</w:t>
-      </w:r>
+        </w:rPr>
+        <w:t>/</w:t>
+      </w:r>
+      <w:proofErr w:type="spellStart"/>
+      <w:r>
+        <w:rPr>
+          <w:color w:val="000000"/>
+        </w:rPr>
+        <w:t>GitHub</w:t>
+      </w:r>
+      <w:proofErr w:type="spellEnd"/>
     </w:p>
     <w:p>
       <w:pPr>
@@ -2638,6 +2548,7 @@
           <w:color w:val="000000"/>
           <w:sz w:val="24"/>
           <w:szCs w:val="24"/>
+          <w:lang w:val="uk-UA"/>
         </w:rPr>
       </w:pPr>
       <w:r>
@@ -2657,7 +2568,7 @@
           <w:color w:val="000000"/>
           <w:sz w:val="24"/>
           <w:szCs w:val="24"/>
-          <w:lang w:val="en-US"/>
+          <w:lang w:val="uk-UA"/>
         </w:rPr>
         <w:t>Git</w:t>
       </w:r>
@@ -2694,16 +2605,18 @@
         </w:rPr>
         <w:t xml:space="preserve"> </w:t>
       </w:r>
+      <w:proofErr w:type="spellStart"/>
       <w:r>
         <w:rPr>
           <w:rFonts w:ascii="Times New Roman" w:hAnsi="Times New Roman" w:cs="Times New Roman"/>
           <w:color w:val="000000"/>
           <w:sz w:val="24"/>
           <w:szCs w:val="24"/>
-          <w:lang w:val="en-US"/>
+          <w:lang w:val="uk-UA"/>
         </w:rPr>
         <w:t>GitHub</w:t>
       </w:r>
+      <w:proofErr w:type="spellEnd"/>
       <w:r>
         <w:rPr>
           <w:rFonts w:ascii="Times New Roman" w:hAnsi="Times New Roman" w:cs="Times New Roman"/>
@@ -2714,16 +2627,18 @@
         </w:rPr>
         <w:t xml:space="preserve">. Ознайомився і практично застосував команди </w:t>
       </w:r>
+      <w:proofErr w:type="spellStart"/>
       <w:r>
         <w:rPr>
           <w:rFonts w:ascii="Times New Roman" w:hAnsi="Times New Roman" w:cs="Times New Roman"/>
           <w:color w:val="000000"/>
           <w:sz w:val="24"/>
           <w:szCs w:val="24"/>
-          <w:lang w:val="en-US"/>
+          <w:lang w:val="uk-UA"/>
         </w:rPr>
         <w:t>add</w:t>
       </w:r>
+      <w:proofErr w:type="spellEnd"/>
       <w:r>
         <w:rPr>
           <w:rFonts w:ascii="Times New Roman" w:hAnsi="Times New Roman" w:cs="Times New Roman"/>
@@ -2741,7 +2656,7 @@
           <w:color w:val="000000"/>
           <w:sz w:val="24"/>
           <w:szCs w:val="24"/>
-          <w:lang w:val="ru-RU"/>
+          <w:lang w:val="uk-UA"/>
         </w:rPr>
         <w:t>push</w:t>
       </w:r>
@@ -2763,7 +2678,7 @@
           <w:color w:val="000000"/>
           <w:sz w:val="24"/>
           <w:szCs w:val="24"/>
-          <w:lang w:val="ru-RU"/>
+          <w:lang w:val="uk-UA"/>
         </w:rPr>
         <w:t>commit</w:t>
       </w:r>
@@ -2785,7 +2700,7 @@
           <w:color w:val="000000"/>
           <w:sz w:val="24"/>
           <w:szCs w:val="24"/>
-          <w:lang w:val="ru-RU"/>
+          <w:lang w:val="uk-UA"/>
         </w:rPr>
         <w:t>etc</w:t>
       </w:r>
@@ -2904,29 +2819,20 @@
         </w:rPr>
         <w:t xml:space="preserve">: </w:t>
       </w:r>
-      <w:proofErr w:type="spellStart"/>
-      <w:r>
-        <w:rPr>
-          <w:color w:val="000000"/>
-          <w:lang w:val="ru-RU"/>
-        </w:rPr>
-        <w:t>Дошка</w:t>
-      </w:r>
-      <w:proofErr w:type="spellEnd"/>
-      <w:r>
-        <w:rPr>
-          <w:color w:val="000000"/>
-          <w:lang w:val="ru-RU"/>
-        </w:rPr>
-        <w:t xml:space="preserve"> </w:t>
-      </w:r>
-      <w:r>
-        <w:rPr>
-          <w:color w:val="000000"/>
-          <w:lang w:val="en-US"/>
+      <w:r>
+        <w:rPr>
+          <w:color w:val="000000"/>
+        </w:rPr>
+        <w:t xml:space="preserve">Дошка </w:t>
+      </w:r>
+      <w:proofErr w:type="spellStart"/>
+      <w:r>
+        <w:rPr>
+          <w:color w:val="000000"/>
         </w:rPr>
         <w:t>Trello</w:t>
       </w:r>
+      <w:proofErr w:type="spellEnd"/>
     </w:p>
     <w:p>
       <w:pPr>
@@ -2965,7 +2871,6 @@
         <w:r>
           <w:rPr>
             <w:rStyle w:val="a6"/>
-            <w:lang w:val="en-US"/>
           </w:rPr>
           <w:t>Trello.com</w:t>
         </w:r>
@@ -3004,6 +2909,7 @@
           <w:color w:val="000000"/>
           <w:sz w:val="24"/>
           <w:szCs w:val="24"/>
+          <w:lang w:val="uk-UA"/>
         </w:rPr>
       </w:pPr>
       <w:r>
@@ -3120,19 +3026,12 @@
         </w:rPr>
         <w:t xml:space="preserve">: </w:t>
       </w:r>
-      <w:r>
-        <w:rPr>
-          <w:color w:val="000000"/>
-          <w:lang w:val="en-US"/>
-        </w:rPr>
-        <w:t>Draw</w:t>
-      </w:r>
-      <w:proofErr w:type="spellStart"/>
-      <w:r>
-        <w:rPr>
-          <w:color w:val="000000"/>
-        </w:rPr>
-        <w:t>io</w:t>
+      <w:proofErr w:type="spellStart"/>
+      <w:r>
+        <w:rPr>
+          <w:color w:val="000000"/>
+        </w:rPr>
+        <w:t>Drawio</w:t>
       </w:r>
       <w:proofErr w:type="spellEnd"/>
     </w:p>
@@ -3173,7 +3072,6 @@
         <w:r>
           <w:rPr>
             <w:rStyle w:val="a6"/>
-            <w:lang w:val="en-US"/>
           </w:rPr>
           <w:t>Drawio.com</w:t>
         </w:r>
@@ -3212,6 +3110,7 @@
           <w:color w:val="000000"/>
           <w:sz w:val="24"/>
           <w:szCs w:val="24"/>
+          <w:lang w:val="uk-UA"/>
         </w:rPr>
       </w:pPr>
       <w:r>
@@ -3387,7 +3286,6 @@
         <w:r>
           <w:rPr>
             <w:rStyle w:val="a6"/>
-            <w:lang w:val="en-US"/>
           </w:rPr>
           <w:t>Algotester</w:t>
         </w:r>
@@ -3427,6 +3325,7 @@
           <w:color w:val="000000"/>
           <w:sz w:val="24"/>
           <w:szCs w:val="24"/>
+          <w:lang w:val="uk-UA"/>
         </w:rPr>
       </w:pPr>
       <w:r>
@@ -3534,6 +3433,7 @@
           <w:rFonts w:ascii="Times New Roman" w:hAnsi="Times New Roman" w:cs="Times New Roman"/>
           <w:sz w:val="24"/>
           <w:szCs w:val="24"/>
+          <w:lang w:val="uk-UA"/>
         </w:rPr>
       </w:pPr>
     </w:p>
@@ -3545,6 +3445,7 @@
           <w:rFonts w:ascii="Times New Roman" w:hAnsi="Times New Roman" w:cs="Times New Roman"/>
           <w:sz w:val="24"/>
           <w:szCs w:val="24"/>
+          <w:lang w:val="uk-UA"/>
         </w:rPr>
       </w:pPr>
       <w:r>
@@ -3553,6 +3454,7 @@
           <w:color w:val="000000"/>
           <w:sz w:val="24"/>
           <w:szCs w:val="24"/>
+          <w:lang w:val="uk-UA"/>
         </w:rPr>
         <w:lastRenderedPageBreak/>
         <w:t>Виконання роботи:</w:t>
@@ -3571,6 +3473,7 @@
           <w:color w:val="000000"/>
           <w:sz w:val="24"/>
           <w:szCs w:val="24"/>
+          <w:lang w:val="uk-UA"/>
         </w:rPr>
       </w:pPr>
       <w:r>
@@ -3579,6 +3482,7 @@
           <w:color w:val="000000"/>
           <w:sz w:val="24"/>
           <w:szCs w:val="24"/>
+          <w:lang w:val="uk-UA"/>
         </w:rPr>
         <w:t>Опрацювання завдання та вимог до програм та середовища: </w:t>
       </w:r>
@@ -3589,6 +3493,7 @@
           <w:rFonts w:ascii="Times New Roman" w:hAnsi="Times New Roman" w:cs="Times New Roman"/>
           <w:sz w:val="24"/>
           <w:szCs w:val="24"/>
+          <w:lang w:val="uk-UA"/>
         </w:rPr>
       </w:pPr>
     </w:p>
@@ -5037,1111 +4942,1101 @@
           <w:iCs/>
           <w:color w:val="000000"/>
         </w:rPr>
-        <w:t>.</w:t>
-      </w:r>
+        <w:t xml:space="preserve">. </w:t>
+      </w:r>
+      <w:proofErr w:type="spellStart"/>
       <w:r>
         <w:rPr>
           <w:i/>
           <w:iCs/>
           <w:color w:val="000000"/>
-          <w:lang w:val="en-US"/>
-        </w:rPr>
-        <w:t xml:space="preserve"> </w:t>
-      </w:r>
-      <w:proofErr w:type="spellStart"/>
+        </w:rPr>
+        <w:t>The</w:t>
+      </w:r>
+      <w:proofErr w:type="spellEnd"/>
       <w:r>
         <w:rPr>
           <w:i/>
           <w:iCs/>
           <w:color w:val="000000"/>
         </w:rPr>
-        <w:t>The</w:t>
-      </w:r>
-      <w:proofErr w:type="spellEnd"/>
+        <w:t xml:space="preserve"> </w:t>
+      </w:r>
+      <w:proofErr w:type="spellStart"/>
       <w:r>
         <w:rPr>
           <w:i/>
           <w:iCs/>
           <w:color w:val="000000"/>
         </w:rPr>
-        <w:t xml:space="preserve"> </w:t>
-      </w:r>
-      <w:proofErr w:type="spellStart"/>
+        <w:t>game</w:t>
+      </w:r>
+      <w:proofErr w:type="spellEnd"/>
       <w:r>
         <w:rPr>
           <w:i/>
           <w:iCs/>
           <w:color w:val="000000"/>
         </w:rPr>
-        <w:t>game</w:t>
-      </w:r>
-      <w:proofErr w:type="spellEnd"/>
+        <w:t xml:space="preserve"> </w:t>
+      </w:r>
+      <w:proofErr w:type="spellStart"/>
       <w:r>
         <w:rPr>
           <w:i/>
           <w:iCs/>
           <w:color w:val="000000"/>
         </w:rPr>
-        <w:t xml:space="preserve"> </w:t>
-      </w:r>
-      <w:proofErr w:type="spellStart"/>
+        <w:t>is</w:t>
+      </w:r>
+      <w:proofErr w:type="spellEnd"/>
       <w:r>
         <w:rPr>
           <w:i/>
           <w:iCs/>
           <w:color w:val="000000"/>
         </w:rPr>
-        <w:t>is</w:t>
-      </w:r>
-      <w:proofErr w:type="spellEnd"/>
+        <w:t xml:space="preserve"> </w:t>
+      </w:r>
+      <w:proofErr w:type="spellStart"/>
       <w:r>
         <w:rPr>
           <w:i/>
           <w:iCs/>
           <w:color w:val="000000"/>
         </w:rPr>
-        <w:t xml:space="preserve"> </w:t>
-      </w:r>
-      <w:proofErr w:type="spellStart"/>
+        <w:t>played</w:t>
+      </w:r>
+      <w:proofErr w:type="spellEnd"/>
       <w:r>
         <w:rPr>
           <w:i/>
           <w:iCs/>
           <w:color w:val="000000"/>
         </w:rPr>
-        <w:t>played</w:t>
-      </w:r>
-      <w:proofErr w:type="spellEnd"/>
+        <w:t xml:space="preserve"> </w:t>
+      </w:r>
+      <w:proofErr w:type="spellStart"/>
       <w:r>
         <w:rPr>
           <w:i/>
           <w:iCs/>
           <w:color w:val="000000"/>
         </w:rPr>
-        <w:t xml:space="preserve"> </w:t>
-      </w:r>
-      <w:proofErr w:type="spellStart"/>
+        <w:t>on</w:t>
+      </w:r>
+      <w:proofErr w:type="spellEnd"/>
       <w:r>
         <w:rPr>
           <w:i/>
           <w:iCs/>
           <w:color w:val="000000"/>
         </w:rPr>
-        <w:t>on</w:t>
-      </w:r>
-      <w:proofErr w:type="spellEnd"/>
+        <w:t xml:space="preserve"> N </w:t>
+      </w:r>
+      <w:proofErr w:type="spellStart"/>
       <w:r>
         <w:rPr>
           <w:i/>
           <w:iCs/>
           <w:color w:val="000000"/>
         </w:rPr>
-        <w:t xml:space="preserve"> N </w:t>
-      </w:r>
-      <w:proofErr w:type="spellStart"/>
+        <w:t>by</w:t>
+      </w:r>
+      <w:proofErr w:type="spellEnd"/>
       <w:r>
         <w:rPr>
           <w:i/>
           <w:iCs/>
           <w:color w:val="000000"/>
         </w:rPr>
-        <w:t>by</w:t>
-      </w:r>
-      <w:proofErr w:type="spellEnd"/>
+        <w:t xml:space="preserve"> M </w:t>
+      </w:r>
+      <w:proofErr w:type="spellStart"/>
       <w:r>
         <w:rPr>
           <w:i/>
           <w:iCs/>
           <w:color w:val="000000"/>
         </w:rPr>
-        <w:t xml:space="preserve"> M </w:t>
-      </w:r>
-      <w:proofErr w:type="spellStart"/>
+        <w:t>board</w:t>
+      </w:r>
+      <w:proofErr w:type="spellEnd"/>
       <w:r>
         <w:rPr>
           <w:i/>
           <w:iCs/>
           <w:color w:val="000000"/>
         </w:rPr>
-        <w:t>board</w:t>
-      </w:r>
-      <w:proofErr w:type="spellEnd"/>
+        <w:t xml:space="preserve">. </w:t>
+      </w:r>
+      <w:proofErr w:type="spellStart"/>
       <w:r>
         <w:rPr>
           <w:i/>
           <w:iCs/>
           <w:color w:val="000000"/>
         </w:rPr>
-        <w:t xml:space="preserve">. </w:t>
-      </w:r>
-      <w:proofErr w:type="spellStart"/>
+        <w:t>Initially</w:t>
+      </w:r>
+      <w:proofErr w:type="spellEnd"/>
       <w:r>
         <w:rPr>
           <w:i/>
           <w:iCs/>
           <w:color w:val="000000"/>
         </w:rPr>
-        <w:t>Initially</w:t>
-      </w:r>
-      <w:proofErr w:type="spellEnd"/>
+        <w:t xml:space="preserve"> </w:t>
+      </w:r>
+      <w:proofErr w:type="spellStart"/>
       <w:r>
         <w:rPr>
           <w:i/>
           <w:iCs/>
           <w:color w:val="000000"/>
         </w:rPr>
-        <w:t xml:space="preserve"> </w:t>
-      </w:r>
-      <w:proofErr w:type="spellStart"/>
+        <w:t>all</w:t>
+      </w:r>
+      <w:proofErr w:type="spellEnd"/>
       <w:r>
         <w:rPr>
           <w:i/>
           <w:iCs/>
           <w:color w:val="000000"/>
         </w:rPr>
-        <w:t>all</w:t>
-      </w:r>
-      <w:proofErr w:type="spellEnd"/>
+        <w:t xml:space="preserve"> </w:t>
+      </w:r>
+      <w:proofErr w:type="spellStart"/>
       <w:r>
         <w:rPr>
           <w:i/>
           <w:iCs/>
           <w:color w:val="000000"/>
         </w:rPr>
-        <w:t xml:space="preserve"> </w:t>
-      </w:r>
-      <w:proofErr w:type="spellStart"/>
+        <w:t>board</w:t>
+      </w:r>
+      <w:proofErr w:type="spellEnd"/>
       <w:r>
         <w:rPr>
           <w:i/>
           <w:iCs/>
           <w:color w:val="000000"/>
         </w:rPr>
-        <w:t>board</w:t>
-      </w:r>
-      <w:proofErr w:type="spellEnd"/>
+        <w:t xml:space="preserve"> </w:t>
+      </w:r>
+      <w:proofErr w:type="spellStart"/>
       <w:r>
         <w:rPr>
           <w:i/>
           <w:iCs/>
           <w:color w:val="000000"/>
         </w:rPr>
-        <w:t xml:space="preserve"> </w:t>
-      </w:r>
-      <w:proofErr w:type="spellStart"/>
+        <w:t>cells</w:t>
+      </w:r>
+      <w:proofErr w:type="spellEnd"/>
       <w:r>
         <w:rPr>
           <w:i/>
           <w:iCs/>
           <w:color w:val="000000"/>
         </w:rPr>
-        <w:t>cells</w:t>
-      </w:r>
-      <w:proofErr w:type="spellEnd"/>
+        <w:t xml:space="preserve"> </w:t>
+      </w:r>
+      <w:proofErr w:type="spellStart"/>
       <w:r>
         <w:rPr>
           <w:i/>
           <w:iCs/>
           <w:color w:val="000000"/>
         </w:rPr>
-        <w:t xml:space="preserve"> </w:t>
-      </w:r>
-      <w:proofErr w:type="spellStart"/>
+        <w:t>are</w:t>
+      </w:r>
+      <w:proofErr w:type="spellEnd"/>
       <w:r>
         <w:rPr>
           <w:i/>
           <w:iCs/>
           <w:color w:val="000000"/>
         </w:rPr>
-        <w:t>are</w:t>
-      </w:r>
-      <w:proofErr w:type="spellEnd"/>
+        <w:t xml:space="preserve"> </w:t>
+      </w:r>
+      <w:proofErr w:type="spellStart"/>
       <w:r>
         <w:rPr>
           <w:i/>
           <w:iCs/>
           <w:color w:val="000000"/>
         </w:rPr>
-        <w:t xml:space="preserve"> </w:t>
-      </w:r>
-      <w:proofErr w:type="spellStart"/>
+        <w:t>white</w:t>
+      </w:r>
+      <w:proofErr w:type="spellEnd"/>
       <w:r>
         <w:rPr>
           <w:i/>
           <w:iCs/>
           <w:color w:val="000000"/>
         </w:rPr>
-        <w:t>white</w:t>
-      </w:r>
-      <w:proofErr w:type="spellEnd"/>
+        <w:t xml:space="preserve">. </w:t>
+      </w:r>
+      <w:proofErr w:type="spellStart"/>
       <w:r>
         <w:rPr>
           <w:i/>
           <w:iCs/>
           <w:color w:val="000000"/>
         </w:rPr>
-        <w:t xml:space="preserve">. </w:t>
-      </w:r>
-      <w:proofErr w:type="spellStart"/>
+        <w:t>The</w:t>
+      </w:r>
+      <w:proofErr w:type="spellEnd"/>
       <w:r>
         <w:rPr>
           <w:i/>
           <w:iCs/>
           <w:color w:val="000000"/>
         </w:rPr>
-        <w:t>The</w:t>
-      </w:r>
-      <w:proofErr w:type="spellEnd"/>
+        <w:t xml:space="preserve"> </w:t>
+      </w:r>
+      <w:proofErr w:type="spellStart"/>
       <w:r>
         <w:rPr>
           <w:i/>
           <w:iCs/>
           <w:color w:val="000000"/>
         </w:rPr>
-        <w:t xml:space="preserve"> </w:t>
-      </w:r>
-      <w:proofErr w:type="spellStart"/>
+        <w:t>players</w:t>
+      </w:r>
+      <w:proofErr w:type="spellEnd"/>
       <w:r>
         <w:rPr>
           <w:i/>
           <w:iCs/>
           <w:color w:val="000000"/>
         </w:rPr>
-        <w:t>players</w:t>
-      </w:r>
-      <w:proofErr w:type="spellEnd"/>
+        <w:t xml:space="preserve"> </w:t>
+      </w:r>
+      <w:proofErr w:type="spellStart"/>
       <w:r>
         <w:rPr>
           <w:i/>
           <w:iCs/>
           <w:color w:val="000000"/>
         </w:rPr>
-        <w:t xml:space="preserve"> </w:t>
-      </w:r>
-      <w:proofErr w:type="spellStart"/>
+        <w:t>alternate</w:t>
+      </w:r>
+      <w:proofErr w:type="spellEnd"/>
       <w:r>
         <w:rPr>
           <w:i/>
           <w:iCs/>
           <w:color w:val="000000"/>
         </w:rPr>
-        <w:t>alternate</w:t>
-      </w:r>
-      <w:proofErr w:type="spellEnd"/>
+        <w:t xml:space="preserve"> </w:t>
+      </w:r>
+      <w:proofErr w:type="spellStart"/>
       <w:r>
         <w:rPr>
           <w:i/>
           <w:iCs/>
           <w:color w:val="000000"/>
         </w:rPr>
-        <w:t xml:space="preserve"> </w:t>
-      </w:r>
-      <w:proofErr w:type="spellStart"/>
+        <w:t>turns</w:t>
+      </w:r>
+      <w:proofErr w:type="spellEnd"/>
       <w:r>
         <w:rPr>
           <w:i/>
           <w:iCs/>
           <w:color w:val="000000"/>
         </w:rPr>
-        <w:t>turns</w:t>
-      </w:r>
-      <w:proofErr w:type="spellEnd"/>
+        <w:t xml:space="preserve"> </w:t>
+      </w:r>
+      <w:proofErr w:type="spellStart"/>
       <w:r>
         <w:rPr>
           <w:i/>
           <w:iCs/>
           <w:color w:val="000000"/>
         </w:rPr>
-        <w:t xml:space="preserve"> </w:t>
-      </w:r>
-      <w:proofErr w:type="spellStart"/>
+        <w:t>and</w:t>
+      </w:r>
+      <w:proofErr w:type="spellEnd"/>
       <w:r>
         <w:rPr>
           <w:i/>
           <w:iCs/>
           <w:color w:val="000000"/>
         </w:rPr>
-        <w:t>and</w:t>
-      </w:r>
-      <w:proofErr w:type="spellEnd"/>
+        <w:t xml:space="preserve"> </w:t>
+      </w:r>
+      <w:proofErr w:type="spellStart"/>
       <w:r>
         <w:rPr>
           <w:i/>
           <w:iCs/>
           <w:color w:val="000000"/>
         </w:rPr>
-        <w:t xml:space="preserve"> </w:t>
-      </w:r>
-      <w:proofErr w:type="spellStart"/>
+        <w:t>Little</w:t>
+      </w:r>
+      <w:proofErr w:type="spellEnd"/>
       <w:r>
         <w:rPr>
           <w:i/>
           <w:iCs/>
           <w:color w:val="000000"/>
         </w:rPr>
-        <w:t>Little</w:t>
-      </w:r>
-      <w:proofErr w:type="spellEnd"/>
+        <w:t xml:space="preserve"> </w:t>
+      </w:r>
+      <w:proofErr w:type="spellStart"/>
       <w:r>
         <w:rPr>
           <w:i/>
           <w:iCs/>
           <w:color w:val="000000"/>
         </w:rPr>
-        <w:t xml:space="preserve"> </w:t>
-      </w:r>
-      <w:proofErr w:type="spellStart"/>
+        <w:t>Imp</w:t>
+      </w:r>
+      <w:proofErr w:type="spellEnd"/>
       <w:r>
         <w:rPr>
           <w:i/>
           <w:iCs/>
           <w:color w:val="000000"/>
         </w:rPr>
-        <w:t>Imp</w:t>
-      </w:r>
-      <w:proofErr w:type="spellEnd"/>
+        <w:t xml:space="preserve"> </w:t>
+      </w:r>
+      <w:proofErr w:type="spellStart"/>
       <w:r>
         <w:rPr>
           <w:i/>
           <w:iCs/>
           <w:color w:val="000000"/>
         </w:rPr>
-        <w:t xml:space="preserve"> </w:t>
-      </w:r>
-      <w:proofErr w:type="spellStart"/>
+        <w:t>starts</w:t>
+      </w:r>
+      <w:proofErr w:type="spellEnd"/>
       <w:r>
         <w:rPr>
           <w:i/>
           <w:iCs/>
           <w:color w:val="000000"/>
         </w:rPr>
-        <w:t>starts</w:t>
-      </w:r>
-      <w:proofErr w:type="spellEnd"/>
+        <w:t xml:space="preserve"> </w:t>
+      </w:r>
+      <w:proofErr w:type="spellStart"/>
       <w:r>
         <w:rPr>
           <w:i/>
           <w:iCs/>
           <w:color w:val="000000"/>
         </w:rPr>
-        <w:t xml:space="preserve"> </w:t>
-      </w:r>
-      <w:proofErr w:type="spellStart"/>
+        <w:t>the</w:t>
+      </w:r>
+      <w:proofErr w:type="spellEnd"/>
       <w:r>
         <w:rPr>
           <w:i/>
           <w:iCs/>
           <w:color w:val="000000"/>
         </w:rPr>
-        <w:t>the</w:t>
-      </w:r>
-      <w:proofErr w:type="spellEnd"/>
+        <w:t xml:space="preserve"> </w:t>
+      </w:r>
+      <w:proofErr w:type="spellStart"/>
       <w:r>
         <w:rPr>
           <w:i/>
           <w:iCs/>
           <w:color w:val="000000"/>
         </w:rPr>
-        <w:t xml:space="preserve"> </w:t>
-      </w:r>
-      <w:proofErr w:type="spellStart"/>
+        <w:t>game</w:t>
+      </w:r>
+      <w:proofErr w:type="spellEnd"/>
       <w:r>
         <w:rPr>
           <w:i/>
           <w:iCs/>
           <w:color w:val="000000"/>
         </w:rPr>
-        <w:t>game</w:t>
-      </w:r>
-      <w:proofErr w:type="spellEnd"/>
+        <w:t xml:space="preserve">. </w:t>
+      </w:r>
+      <w:proofErr w:type="spellStart"/>
       <w:r>
         <w:rPr>
           <w:i/>
           <w:iCs/>
           <w:color w:val="000000"/>
         </w:rPr>
-        <w:t xml:space="preserve">. </w:t>
-      </w:r>
-      <w:proofErr w:type="spellStart"/>
+        <w:t>While</w:t>
+      </w:r>
+      <w:proofErr w:type="spellEnd"/>
       <w:r>
         <w:rPr>
           <w:i/>
           <w:iCs/>
           <w:color w:val="000000"/>
         </w:rPr>
-        <w:t>While</w:t>
-      </w:r>
-      <w:proofErr w:type="spellEnd"/>
+        <w:t xml:space="preserve"> </w:t>
+      </w:r>
+      <w:proofErr w:type="spellStart"/>
       <w:r>
         <w:rPr>
           <w:i/>
           <w:iCs/>
           <w:color w:val="000000"/>
         </w:rPr>
-        <w:t xml:space="preserve"> </w:t>
-      </w:r>
-      <w:proofErr w:type="spellStart"/>
+        <w:t>making</w:t>
+      </w:r>
+      <w:proofErr w:type="spellEnd"/>
       <w:r>
         <w:rPr>
           <w:i/>
           <w:iCs/>
           <w:color w:val="000000"/>
         </w:rPr>
-        <w:t>making</w:t>
-      </w:r>
-      <w:proofErr w:type="spellEnd"/>
+        <w:t xml:space="preserve"> a </w:t>
+      </w:r>
+      <w:proofErr w:type="spellStart"/>
       <w:r>
         <w:rPr>
           <w:i/>
           <w:iCs/>
           <w:color w:val="000000"/>
         </w:rPr>
-        <w:t xml:space="preserve"> a </w:t>
-      </w:r>
-      <w:proofErr w:type="spellStart"/>
+        <w:t>turn</w:t>
+      </w:r>
+      <w:proofErr w:type="spellEnd"/>
       <w:r>
         <w:rPr>
           <w:i/>
           <w:iCs/>
           <w:color w:val="000000"/>
         </w:rPr>
-        <w:t>turn</w:t>
-      </w:r>
-      <w:proofErr w:type="spellEnd"/>
+        <w:t xml:space="preserve"> a </w:t>
+      </w:r>
+      <w:proofErr w:type="spellStart"/>
       <w:r>
         <w:rPr>
           <w:i/>
           <w:iCs/>
           <w:color w:val="000000"/>
         </w:rPr>
-        <w:t xml:space="preserve"> a </w:t>
-      </w:r>
-      <w:proofErr w:type="spellStart"/>
+        <w:t>player</w:t>
+      </w:r>
+      <w:proofErr w:type="spellEnd"/>
       <w:r>
         <w:rPr>
           <w:i/>
           <w:iCs/>
           <w:color w:val="000000"/>
         </w:rPr>
-        <w:t>player</w:t>
-      </w:r>
-      <w:proofErr w:type="spellEnd"/>
+        <w:t xml:space="preserve"> </w:t>
+      </w:r>
+      <w:proofErr w:type="spellStart"/>
       <w:r>
         <w:rPr>
           <w:i/>
           <w:iCs/>
           <w:color w:val="000000"/>
         </w:rPr>
-        <w:t xml:space="preserve"> </w:t>
-      </w:r>
-      <w:proofErr w:type="spellStart"/>
+        <w:t>selects</w:t>
+      </w:r>
+      <w:proofErr w:type="spellEnd"/>
       <w:r>
         <w:rPr>
           <w:i/>
           <w:iCs/>
           <w:color w:val="000000"/>
         </w:rPr>
-        <w:t>selects</w:t>
-      </w:r>
-      <w:proofErr w:type="spellEnd"/>
+        <w:t xml:space="preserve"> a </w:t>
+      </w:r>
+      <w:proofErr w:type="spellStart"/>
       <w:r>
         <w:rPr>
           <w:i/>
           <w:iCs/>
           <w:color w:val="000000"/>
         </w:rPr>
-        <w:t xml:space="preserve"> a </w:t>
-      </w:r>
-      <w:proofErr w:type="spellStart"/>
+        <w:t>white</w:t>
+      </w:r>
+      <w:proofErr w:type="spellEnd"/>
       <w:r>
         <w:rPr>
           <w:i/>
           <w:iCs/>
           <w:color w:val="000000"/>
         </w:rPr>
-        <w:t>white</w:t>
-      </w:r>
-      <w:proofErr w:type="spellEnd"/>
+        <w:t xml:space="preserve"> </w:t>
+      </w:r>
+      <w:proofErr w:type="spellStart"/>
       <w:r>
         <w:rPr>
           <w:i/>
           <w:iCs/>
           <w:color w:val="000000"/>
         </w:rPr>
-        <w:t xml:space="preserve"> </w:t>
-      </w:r>
-      <w:proofErr w:type="spellStart"/>
+        <w:t>board</w:t>
+      </w:r>
+      <w:proofErr w:type="spellEnd"/>
       <w:r>
         <w:rPr>
           <w:i/>
           <w:iCs/>
           <w:color w:val="000000"/>
         </w:rPr>
-        <w:t>board</w:t>
-      </w:r>
-      <w:proofErr w:type="spellEnd"/>
+        <w:t xml:space="preserve"> </w:t>
+      </w:r>
+      <w:proofErr w:type="spellStart"/>
       <w:r>
         <w:rPr>
           <w:i/>
           <w:iCs/>
           <w:color w:val="000000"/>
         </w:rPr>
-        <w:t xml:space="preserve"> </w:t>
-      </w:r>
-      <w:proofErr w:type="spellStart"/>
+        <w:t>cell</w:t>
+      </w:r>
+      <w:proofErr w:type="spellEnd"/>
       <w:r>
         <w:rPr>
           <w:i/>
           <w:iCs/>
           <w:color w:val="000000"/>
         </w:rPr>
-        <w:t>cell</w:t>
-      </w:r>
-      <w:proofErr w:type="spellEnd"/>
+        <w:t xml:space="preserve"> </w:t>
+      </w:r>
+      <w:proofErr w:type="spellStart"/>
       <w:r>
         <w:rPr>
           <w:i/>
           <w:iCs/>
           <w:color w:val="000000"/>
         </w:rPr>
-        <w:t xml:space="preserve"> </w:t>
-      </w:r>
-      <w:proofErr w:type="spellStart"/>
+        <w:t>and</w:t>
+      </w:r>
+      <w:proofErr w:type="spellEnd"/>
       <w:r>
         <w:rPr>
           <w:i/>
           <w:iCs/>
           <w:color w:val="000000"/>
         </w:rPr>
-        <w:t>and</w:t>
-      </w:r>
-      <w:proofErr w:type="spellEnd"/>
+        <w:t xml:space="preserve"> </w:t>
+      </w:r>
+      <w:proofErr w:type="spellStart"/>
       <w:r>
         <w:rPr>
           <w:i/>
           <w:iCs/>
           <w:color w:val="000000"/>
         </w:rPr>
-        <w:t xml:space="preserve"> </w:t>
-      </w:r>
-      <w:proofErr w:type="spellStart"/>
+        <w:t>paints</w:t>
+      </w:r>
+      <w:proofErr w:type="spellEnd"/>
       <w:r>
         <w:rPr>
           <w:i/>
           <w:iCs/>
           <w:color w:val="000000"/>
         </w:rPr>
-        <w:t>paints</w:t>
-      </w:r>
-      <w:proofErr w:type="spellEnd"/>
+        <w:t xml:space="preserve"> </w:t>
+      </w:r>
+      <w:proofErr w:type="spellStart"/>
       <w:r>
         <w:rPr>
           <w:i/>
           <w:iCs/>
           <w:color w:val="000000"/>
         </w:rPr>
-        <w:t xml:space="preserve"> </w:t>
-      </w:r>
-      <w:proofErr w:type="spellStart"/>
+        <w:t>it</w:t>
+      </w:r>
+      <w:proofErr w:type="spellEnd"/>
       <w:r>
         <w:rPr>
           <w:i/>
           <w:iCs/>
           <w:color w:val="000000"/>
         </w:rPr>
-        <w:t>it</w:t>
-      </w:r>
-      <w:proofErr w:type="spellEnd"/>
+        <w:t xml:space="preserve"> </w:t>
+      </w:r>
+      <w:proofErr w:type="spellStart"/>
       <w:r>
         <w:rPr>
           <w:i/>
           <w:iCs/>
           <w:color w:val="000000"/>
         </w:rPr>
-        <w:t xml:space="preserve"> </w:t>
-      </w:r>
-      <w:proofErr w:type="spellStart"/>
+        <w:t>black</w:t>
+      </w:r>
+      <w:proofErr w:type="spellEnd"/>
       <w:r>
         <w:rPr>
           <w:i/>
           <w:iCs/>
           <w:color w:val="000000"/>
         </w:rPr>
-        <w:t>black</w:t>
-      </w:r>
-      <w:proofErr w:type="spellEnd"/>
+        <w:t xml:space="preserve">. A </w:t>
+      </w:r>
+      <w:proofErr w:type="spellStart"/>
       <w:r>
         <w:rPr>
           <w:i/>
           <w:iCs/>
           <w:color w:val="000000"/>
         </w:rPr>
-        <w:t xml:space="preserve">. A </w:t>
-      </w:r>
-      <w:proofErr w:type="spellStart"/>
+        <w:t>player</w:t>
+      </w:r>
+      <w:proofErr w:type="spellEnd"/>
       <w:r>
         <w:rPr>
           <w:i/>
           <w:iCs/>
           <w:color w:val="000000"/>
         </w:rPr>
-        <w:t>player</w:t>
-      </w:r>
-      <w:proofErr w:type="spellEnd"/>
+        <w:t xml:space="preserve"> </w:t>
+      </w:r>
+      <w:proofErr w:type="spellStart"/>
       <w:r>
         <w:rPr>
           <w:i/>
           <w:iCs/>
           <w:color w:val="000000"/>
         </w:rPr>
-        <w:t xml:space="preserve"> </w:t>
-      </w:r>
-      <w:proofErr w:type="spellStart"/>
+        <w:t>who</w:t>
+      </w:r>
+      <w:proofErr w:type="spellEnd"/>
       <w:r>
         <w:rPr>
           <w:i/>
           <w:iCs/>
           <w:color w:val="000000"/>
         </w:rPr>
-        <w:t>who</w:t>
-      </w:r>
-      <w:proofErr w:type="spellEnd"/>
+        <w:t xml:space="preserve"> </w:t>
+      </w:r>
+      <w:proofErr w:type="spellStart"/>
       <w:r>
         <w:rPr>
           <w:i/>
           <w:iCs/>
           <w:color w:val="000000"/>
         </w:rPr>
-        <w:t xml:space="preserve"> </w:t>
-      </w:r>
-      <w:proofErr w:type="spellStart"/>
+        <w:t>can</w:t>
+      </w:r>
+      <w:proofErr w:type="spellEnd"/>
       <w:r>
         <w:rPr>
           <w:i/>
           <w:iCs/>
           <w:color w:val="000000"/>
         </w:rPr>
-        <w:t>can</w:t>
-      </w:r>
-      <w:proofErr w:type="spellEnd"/>
+        <w:t xml:space="preserve"> </w:t>
+      </w:r>
+      <w:proofErr w:type="spellStart"/>
       <w:r>
         <w:rPr>
           <w:i/>
           <w:iCs/>
           <w:color w:val="000000"/>
         </w:rPr>
-        <w:t xml:space="preserve"> </w:t>
-      </w:r>
-      <w:proofErr w:type="spellStart"/>
+        <w:t>not</w:t>
+      </w:r>
+      <w:proofErr w:type="spellEnd"/>
       <w:r>
         <w:rPr>
           <w:i/>
           <w:iCs/>
           <w:color w:val="000000"/>
         </w:rPr>
-        <w:t>not</w:t>
-      </w:r>
-      <w:proofErr w:type="spellEnd"/>
+        <w:t xml:space="preserve"> </w:t>
+      </w:r>
+      <w:proofErr w:type="spellStart"/>
       <w:r>
         <w:rPr>
           <w:i/>
           <w:iCs/>
           <w:color w:val="000000"/>
         </w:rPr>
-        <w:t xml:space="preserve"> </w:t>
-      </w:r>
-      <w:proofErr w:type="spellStart"/>
+        <w:t>make</w:t>
+      </w:r>
+      <w:proofErr w:type="spellEnd"/>
       <w:r>
         <w:rPr>
           <w:i/>
           <w:iCs/>
           <w:color w:val="000000"/>
         </w:rPr>
-        <w:t>make</w:t>
-      </w:r>
-      <w:proofErr w:type="spellEnd"/>
+        <w:t xml:space="preserve"> a </w:t>
+      </w:r>
+      <w:proofErr w:type="spellStart"/>
       <w:r>
         <w:rPr>
           <w:i/>
           <w:iCs/>
           <w:color w:val="000000"/>
         </w:rPr>
-        <w:t xml:space="preserve"> a </w:t>
-      </w:r>
-      <w:proofErr w:type="spellStart"/>
+        <w:t>valid</w:t>
+      </w:r>
+      <w:proofErr w:type="spellEnd"/>
       <w:r>
         <w:rPr>
           <w:i/>
           <w:iCs/>
           <w:color w:val="000000"/>
         </w:rPr>
-        <w:t>valid</w:t>
-      </w:r>
-      <w:proofErr w:type="spellEnd"/>
+        <w:t xml:space="preserve"> </w:t>
+      </w:r>
+      <w:proofErr w:type="spellStart"/>
       <w:r>
         <w:rPr>
           <w:i/>
           <w:iCs/>
           <w:color w:val="000000"/>
         </w:rPr>
-        <w:t xml:space="preserve"> </w:t>
-      </w:r>
-      <w:proofErr w:type="spellStart"/>
+        <w:t>move</w:t>
+      </w:r>
+      <w:proofErr w:type="spellEnd"/>
       <w:r>
         <w:rPr>
           <w:i/>
           <w:iCs/>
           <w:color w:val="000000"/>
         </w:rPr>
-        <w:t>move</w:t>
-      </w:r>
-      <w:proofErr w:type="spellEnd"/>
+        <w:t xml:space="preserve"> (</w:t>
+      </w:r>
+      <w:proofErr w:type="spellStart"/>
       <w:r>
         <w:rPr>
           <w:i/>
           <w:iCs/>
           <w:color w:val="000000"/>
         </w:rPr>
-        <w:t xml:space="preserve"> (</w:t>
-      </w:r>
-      <w:proofErr w:type="spellStart"/>
+        <w:t>because</w:t>
+      </w:r>
+      <w:proofErr w:type="spellEnd"/>
       <w:r>
         <w:rPr>
           <w:i/>
           <w:iCs/>
           <w:color w:val="000000"/>
         </w:rPr>
-        <w:t>because</w:t>
-      </w:r>
-      <w:proofErr w:type="spellEnd"/>
+        <w:t xml:space="preserve"> </w:t>
+      </w:r>
+      <w:proofErr w:type="spellStart"/>
       <w:r>
         <w:rPr>
           <w:i/>
           <w:iCs/>
           <w:color w:val="000000"/>
         </w:rPr>
-        <w:t xml:space="preserve"> </w:t>
-      </w:r>
-      <w:proofErr w:type="spellStart"/>
+        <w:t>all</w:t>
+      </w:r>
+      <w:proofErr w:type="spellEnd"/>
       <w:r>
         <w:rPr>
           <w:i/>
           <w:iCs/>
           <w:color w:val="000000"/>
         </w:rPr>
-        <w:t>all</w:t>
-      </w:r>
-      <w:proofErr w:type="spellEnd"/>
+        <w:t xml:space="preserve"> </w:t>
+      </w:r>
+      <w:proofErr w:type="spellStart"/>
       <w:r>
         <w:rPr>
           <w:i/>
           <w:iCs/>
           <w:color w:val="000000"/>
         </w:rPr>
-        <w:t xml:space="preserve"> </w:t>
-      </w:r>
-      <w:proofErr w:type="spellStart"/>
+        <w:t>the</w:t>
+      </w:r>
+      <w:proofErr w:type="spellEnd"/>
       <w:r>
         <w:rPr>
           <w:i/>
           <w:iCs/>
           <w:color w:val="000000"/>
         </w:rPr>
-        <w:t>the</w:t>
-      </w:r>
-      <w:proofErr w:type="spellEnd"/>
+        <w:t xml:space="preserve"> </w:t>
+      </w:r>
+      <w:proofErr w:type="spellStart"/>
       <w:r>
         <w:rPr>
           <w:i/>
           <w:iCs/>
           <w:color w:val="000000"/>
         </w:rPr>
-        <w:t xml:space="preserve"> </w:t>
-      </w:r>
-      <w:proofErr w:type="spellStart"/>
+        <w:t>board</w:t>
+      </w:r>
+      <w:proofErr w:type="spellEnd"/>
       <w:r>
         <w:rPr>
           <w:i/>
           <w:iCs/>
           <w:color w:val="000000"/>
         </w:rPr>
-        <w:t>board</w:t>
-      </w:r>
-      <w:proofErr w:type="spellEnd"/>
+        <w:t xml:space="preserve"> </w:t>
+      </w:r>
+      <w:proofErr w:type="spellStart"/>
       <w:r>
         <w:rPr>
           <w:i/>
           <w:iCs/>
           <w:color w:val="000000"/>
         </w:rPr>
-        <w:t xml:space="preserve"> </w:t>
-      </w:r>
-      <w:proofErr w:type="spellStart"/>
+        <w:t>is</w:t>
+      </w:r>
+      <w:proofErr w:type="spellEnd"/>
       <w:r>
         <w:rPr>
           <w:i/>
           <w:iCs/>
           <w:color w:val="000000"/>
         </w:rPr>
-        <w:t>is</w:t>
-      </w:r>
-      <w:proofErr w:type="spellEnd"/>
+        <w:t xml:space="preserve"> </w:t>
+      </w:r>
+      <w:proofErr w:type="spellStart"/>
       <w:r>
         <w:rPr>
           <w:i/>
           <w:iCs/>
           <w:color w:val="000000"/>
         </w:rPr>
-        <w:t xml:space="preserve"> </w:t>
-      </w:r>
-      <w:proofErr w:type="spellStart"/>
+        <w:t>black</w:t>
+      </w:r>
+      <w:proofErr w:type="spellEnd"/>
       <w:r>
         <w:rPr>
           <w:i/>
           <w:iCs/>
           <w:color w:val="000000"/>
         </w:rPr>
-        <w:t>black</w:t>
-      </w:r>
-      <w:proofErr w:type="spellEnd"/>
+        <w:t xml:space="preserve">) </w:t>
+      </w:r>
+      <w:proofErr w:type="spellStart"/>
       <w:r>
         <w:rPr>
           <w:i/>
           <w:iCs/>
           <w:color w:val="000000"/>
         </w:rPr>
-        <w:t xml:space="preserve">) </w:t>
-      </w:r>
-      <w:proofErr w:type="spellStart"/>
+        <w:t>looses</w:t>
+      </w:r>
+      <w:proofErr w:type="spellEnd"/>
       <w:r>
         <w:rPr>
           <w:i/>
           <w:iCs/>
           <w:color w:val="000000"/>
         </w:rPr>
-        <w:t>looses</w:t>
-      </w:r>
-      <w:proofErr w:type="spellEnd"/>
+        <w:t xml:space="preserve"> </w:t>
+      </w:r>
+      <w:proofErr w:type="spellStart"/>
       <w:r>
         <w:rPr>
           <w:i/>
           <w:iCs/>
           <w:color w:val="000000"/>
         </w:rPr>
-        <w:t xml:space="preserve"> </w:t>
-      </w:r>
-      <w:proofErr w:type="spellStart"/>
+        <w:t>the</w:t>
+      </w:r>
+      <w:proofErr w:type="spellEnd"/>
       <w:r>
         <w:rPr>
           <w:i/>
           <w:iCs/>
           <w:color w:val="000000"/>
         </w:rPr>
-        <w:t>the</w:t>
-      </w:r>
-      <w:proofErr w:type="spellEnd"/>
+        <w:t xml:space="preserve"> </w:t>
+      </w:r>
+      <w:proofErr w:type="spellStart"/>
       <w:r>
         <w:rPr>
           <w:i/>
           <w:iCs/>
           <w:color w:val="000000"/>
         </w:rPr>
-        <w:t xml:space="preserve"> </w:t>
-      </w:r>
-      <w:proofErr w:type="spellStart"/>
+        <w:t>game</w:t>
+      </w:r>
+      <w:proofErr w:type="spellEnd"/>
       <w:r>
         <w:rPr>
           <w:i/>
           <w:iCs/>
           <w:color w:val="000000"/>
         </w:rPr>
-        <w:t>game</w:t>
-      </w:r>
-      <w:proofErr w:type="spellEnd"/>
+        <w:t xml:space="preserve"> </w:t>
+      </w:r>
+      <w:proofErr w:type="spellStart"/>
       <w:r>
         <w:rPr>
           <w:i/>
           <w:iCs/>
           <w:color w:val="000000"/>
         </w:rPr>
-        <w:t xml:space="preserve"> </w:t>
-      </w:r>
-      <w:proofErr w:type="spellStart"/>
+        <w:t>and</w:t>
+      </w:r>
+      <w:proofErr w:type="spellEnd"/>
       <w:r>
         <w:rPr>
           <w:i/>
           <w:iCs/>
           <w:color w:val="000000"/>
         </w:rPr>
-        <w:t>and</w:t>
-      </w:r>
-      <w:proofErr w:type="spellEnd"/>
+        <w:t xml:space="preserve"> </w:t>
+      </w:r>
+      <w:proofErr w:type="spellStart"/>
       <w:r>
         <w:rPr>
           <w:i/>
           <w:iCs/>
           <w:color w:val="000000"/>
         </w:rPr>
-        <w:t xml:space="preserve"> </w:t>
-      </w:r>
-      <w:proofErr w:type="spellStart"/>
+        <w:t>his</w:t>
+      </w:r>
+      <w:proofErr w:type="spellEnd"/>
       <w:r>
         <w:rPr>
           <w:i/>
           <w:iCs/>
           <w:color w:val="000000"/>
         </w:rPr>
-        <w:t>his</w:t>
-      </w:r>
-      <w:proofErr w:type="spellEnd"/>
+        <w:t xml:space="preserve"> </w:t>
+      </w:r>
+      <w:proofErr w:type="spellStart"/>
       <w:r>
         <w:rPr>
           <w:i/>
           <w:iCs/>
           <w:color w:val="000000"/>
         </w:rPr>
-        <w:t xml:space="preserve"> </w:t>
-      </w:r>
-      <w:proofErr w:type="spellStart"/>
+        <w:t>opponent</w:t>
+      </w:r>
+      <w:proofErr w:type="spellEnd"/>
       <w:r>
         <w:rPr>
           <w:i/>
           <w:iCs/>
           <w:color w:val="000000"/>
         </w:rPr>
-        <w:t>opponent</w:t>
-      </w:r>
-      <w:proofErr w:type="spellEnd"/>
+        <w:t xml:space="preserve"> </w:t>
+      </w:r>
+      <w:proofErr w:type="spellStart"/>
       <w:r>
         <w:rPr>
           <w:i/>
           <w:iCs/>
           <w:color w:val="000000"/>
         </w:rPr>
-        <w:t xml:space="preserve"> </w:t>
-      </w:r>
-      <w:proofErr w:type="spellStart"/>
+        <w:t>is</w:t>
+      </w:r>
+      <w:proofErr w:type="spellEnd"/>
       <w:r>
         <w:rPr>
           <w:i/>
           <w:iCs/>
           <w:color w:val="000000"/>
         </w:rPr>
-        <w:t>is</w:t>
-      </w:r>
-      <w:proofErr w:type="spellEnd"/>
+        <w:t xml:space="preserve"> </w:t>
+      </w:r>
+      <w:proofErr w:type="spellStart"/>
       <w:r>
         <w:rPr>
           <w:i/>
           <w:iCs/>
           <w:color w:val="000000"/>
         </w:rPr>
-        <w:t xml:space="preserve"> </w:t>
-      </w:r>
-      <w:proofErr w:type="spellStart"/>
+        <w:t>considered</w:t>
+      </w:r>
+      <w:proofErr w:type="spellEnd"/>
       <w:r>
         <w:rPr>
           <w:i/>
           <w:iCs/>
           <w:color w:val="000000"/>
         </w:rPr>
-        <w:t>considered</w:t>
-      </w:r>
-      <w:proofErr w:type="spellEnd"/>
+        <w:t xml:space="preserve"> </w:t>
+      </w:r>
+      <w:proofErr w:type="spellStart"/>
       <w:r>
         <w:rPr>
           <w:i/>
           <w:iCs/>
           <w:color w:val="000000"/>
         </w:rPr>
-        <w:t xml:space="preserve"> </w:t>
-      </w:r>
-      <w:proofErr w:type="spellStart"/>
+        <w:t>to</w:t>
+      </w:r>
+      <w:proofErr w:type="spellEnd"/>
       <w:r>
         <w:rPr>
           <w:i/>
           <w:iCs/>
           <w:color w:val="000000"/>
         </w:rPr>
-        <w:t>to</w:t>
-      </w:r>
-      <w:proofErr w:type="spellEnd"/>
+        <w:t xml:space="preserve"> </w:t>
+      </w:r>
+      <w:proofErr w:type="spellStart"/>
       <w:r>
         <w:rPr>
           <w:i/>
           <w:iCs/>
           <w:color w:val="000000"/>
         </w:rPr>
-        <w:t xml:space="preserve"> </w:t>
-      </w:r>
-      <w:proofErr w:type="spellStart"/>
+        <w:t>be</w:t>
+      </w:r>
+      <w:proofErr w:type="spellEnd"/>
       <w:r>
         <w:rPr>
           <w:i/>
           <w:iCs/>
           <w:color w:val="000000"/>
         </w:rPr>
-        <w:t>be</w:t>
-      </w:r>
-      <w:proofErr w:type="spellEnd"/>
+        <w:t xml:space="preserve"> a </w:t>
+      </w:r>
+      <w:proofErr w:type="spellStart"/>
       <w:r>
         <w:rPr>
           <w:i/>
           <w:iCs/>
           <w:color w:val="000000"/>
         </w:rPr>
-        <w:t xml:space="preserve"> a </w:t>
-      </w:r>
-      <w:proofErr w:type="spellStart"/>
+        <w:t>winner</w:t>
+      </w:r>
+      <w:proofErr w:type="spellEnd"/>
       <w:r>
         <w:rPr>
           <w:i/>
           <w:iCs/>
           <w:color w:val="000000"/>
         </w:rPr>
-        <w:t>winner</w:t>
-      </w:r>
-      <w:proofErr w:type="spellEnd"/>
-      <w:r>
+        <w:t>.</w:t>
+      </w:r>
+    </w:p>
+    <w:p>
+      <w:pPr>
+        <w:pStyle w:val="a5"/>
+        <w:textAlignment w:val="baseline"/>
         <w:rPr>
           <w:i/>
           <w:iCs/>
           <w:color w:val="000000"/>
         </w:rPr>
-        <w:t>.</w:t>
-      </w:r>
-    </w:p>
-    <w:p>
-      <w:pPr>
-        <w:pStyle w:val="a5"/>
-        <w:textAlignment w:val="baseline"/>
+      </w:pPr>
+      <w:r>
         <w:rPr>
           <w:i/>
           <w:iCs/>
           <w:color w:val="000000"/>
         </w:rPr>
-      </w:pPr>
+        <w:t>Вимоги</w:t>
+      </w:r>
+      <w:r>
+        <w:rPr>
+          <w:i/>
+          <w:color w:val="000000"/>
+        </w:rPr>
+        <w:t>:</w:t>
+      </w:r>
       <w:r>
         <w:rPr>
           <w:i/>
           <w:iCs/>
           <w:color w:val="000000"/>
-        </w:rPr>
-        <w:t>Вимоги</w:t>
-      </w:r>
-      <w:r>
-        <w:rPr>
-          <w:i/>
-          <w:color w:val="000000"/>
-        </w:rPr>
-        <w:t>:</w:t>
-      </w:r>
-      <w:r>
-        <w:rPr>
-          <w:i/>
-          <w:iCs/>
-          <w:color w:val="000000"/>
-          <w:lang w:val="en-US"/>
         </w:rPr>
         <w:t xml:space="preserve"> </w:t>
       </w:r>
@@ -6319,6 +6214,7 @@
           <w:color w:val="000000"/>
           <w:sz w:val="24"/>
           <w:szCs w:val="24"/>
+          <w:lang w:val="uk-UA"/>
         </w:rPr>
         <w:lastRenderedPageBreak/>
         <w:t>Дизайн та планована оцінка часу виконання завдань: </w:t>
@@ -6329,6 +6225,7 @@
           <w:color w:val="000000"/>
           <w:sz w:val="24"/>
           <w:szCs w:val="24"/>
+          <w:lang w:val="uk-UA"/>
         </w:rPr>
         <w:br/>
       </w:r>
@@ -6338,6 +6235,7 @@
           <w:color w:val="000000"/>
           <w:sz w:val="24"/>
           <w:szCs w:val="24"/>
+          <w:lang w:val="uk-UA"/>
         </w:rPr>
         <w:br/>
       </w:r>
@@ -6406,6 +6304,7 @@
           <w:noProof/>
           <w:color w:val="000000"/>
         </w:rPr>
+        <w:lastRenderedPageBreak/>
         <w:drawing>
           <wp:anchor distT="0" distB="0" distL="114300" distR="114300" simplePos="0" relativeHeight="251668480" behindDoc="0" locked="0" layoutInCell="1" allowOverlap="1" wp14:anchorId="297128A3" wp14:editId="7530C8D5">
             <wp:simplePos x="0" y="0"/>
@@ -6742,13 +6641,7 @@
                         <w:rPr>
                           <w:lang w:val="uk-UA"/>
                         </w:rPr>
-                        <w:t xml:space="preserve"> </w:t>
-                      </w:r>
-                      <w:r>
-                        <w:rPr>
-                          <w:lang w:val="uk-UA"/>
-                        </w:rPr>
-                        <w:t>блок-схема</w:t>
+                        <w:t xml:space="preserve"> блок-схема</w:t>
                       </w:r>
                       <w:r>
                         <w:rPr>
@@ -6866,13 +6759,7 @@
                         <w:rPr>
                           <w:lang w:val="uk-UA"/>
                         </w:rPr>
-                        <w:t xml:space="preserve"> </w:t>
-                      </w:r>
-                      <w:r>
-                        <w:rPr>
-                          <w:lang w:val="uk-UA"/>
-                        </w:rPr>
-                        <w:t>блок-схема</w:t>
+                        <w:t xml:space="preserve"> блок-схема</w:t>
                       </w:r>
                       <w:r>
                         <w:rPr>
@@ -7002,6 +6889,7 @@
           <w:rFonts w:ascii="Times New Roman" w:hAnsi="Times New Roman" w:cs="Times New Roman"/>
           <w:sz w:val="24"/>
           <w:szCs w:val="24"/>
+          <w:lang w:val="uk-UA"/>
         </w:rPr>
       </w:pPr>
     </w:p>
@@ -7013,6 +6901,7 @@
           <w:rFonts w:ascii="Times New Roman" w:hAnsi="Times New Roman" w:cs="Times New Roman"/>
           <w:sz w:val="24"/>
           <w:szCs w:val="24"/>
+          <w:lang w:val="uk-UA"/>
         </w:rPr>
       </w:pPr>
       <w:r>
@@ -7021,7 +6910,9 @@
           <w:color w:val="000000"/>
           <w:sz w:val="24"/>
           <w:szCs w:val="24"/>
-        </w:rPr>
+          <w:lang w:val="uk-UA"/>
+        </w:rPr>
+        <w:lastRenderedPageBreak/>
         <w:t>3.</w:t>
       </w:r>
       <w:r>
@@ -7031,6 +6922,7 @@
           <w:color w:val="000000"/>
           <w:sz w:val="24"/>
           <w:szCs w:val="24"/>
+          <w:lang w:val="uk-UA"/>
         </w:rPr>
         <w:tab/>
       </w:r>
@@ -7040,6 +6932,7 @@
           <w:color w:val="000000"/>
           <w:sz w:val="24"/>
           <w:szCs w:val="24"/>
+          <w:lang w:val="uk-UA"/>
         </w:rPr>
         <w:t>Конфігурація середовища до виконання завдань:</w:t>
       </w:r>
@@ -7143,7 +7036,7 @@
           <w:rFonts w:ascii="Times New Roman" w:hAnsi="Times New Roman" w:cs="Times New Roman"/>
           <w:sz w:val="24"/>
           <w:szCs w:val="24"/>
-          <w:lang w:val="en-US"/>
+          <w:lang w:val="uk-UA"/>
         </w:rPr>
       </w:pPr>
       <w:r>
@@ -7155,15 +7048,17 @@
         </w:rPr>
         <w:t xml:space="preserve">створено дошку </w:t>
       </w:r>
+      <w:proofErr w:type="spellStart"/>
       <w:r>
         <w:rPr>
           <w:rFonts w:ascii="Times New Roman" w:hAnsi="Times New Roman" w:cs="Times New Roman"/>
           <w:sz w:val="24"/>
           <w:szCs w:val="24"/>
-          <w:lang w:val="en-US"/>
+          <w:lang w:val="uk-UA"/>
         </w:rPr>
         <w:t>Trello</w:t>
       </w:r>
+      <w:proofErr w:type="spellEnd"/>
     </w:p>
     <w:p>
       <w:pPr>
@@ -7171,7 +7066,6 @@
         <w:spacing w:before="0" w:beforeAutospacing="0" w:after="0" w:afterAutospacing="0"/>
         <w:rPr>
           <w:color w:val="000000"/>
-          <w:lang w:val="en-US"/>
         </w:rPr>
       </w:pPr>
       <w:r>
@@ -7466,6 +7360,7 @@
           <w:rFonts w:ascii="Times New Roman" w:hAnsi="Times New Roman" w:cs="Times New Roman"/>
           <w:sz w:val="24"/>
           <w:szCs w:val="24"/>
+          <w:lang w:val="uk-UA"/>
         </w:rPr>
       </w:pPr>
       <w:r>
@@ -7476,6 +7371,7 @@
           <w:szCs w:val="24"/>
           <w:lang w:val="uk-UA"/>
         </w:rPr>
+        <w:lastRenderedPageBreak/>
         <w:drawing>
           <wp:inline distT="0" distB="0" distL="0" distR="0" wp14:anchorId="2621386B" wp14:editId="637E3A7C">
             <wp:extent cx="5733415" cy="4311650"/>
@@ -7531,67 +7427,27 @@
           <w:szCs w:val="24"/>
           <w:lang w:val="uk-UA"/>
         </w:rPr>
-        <w:t xml:space="preserve">Інстальовано і налаштовано </w:t>
-      </w:r>
+        <w:t xml:space="preserve">Інстальовано і налаштовано VS </w:t>
+      </w:r>
+      <w:proofErr w:type="spellStart"/>
       <w:r>
         <w:rPr>
           <w:rFonts w:ascii="Times New Roman" w:hAnsi="Times New Roman" w:cs="Times New Roman"/>
           <w:sz w:val="24"/>
           <w:szCs w:val="24"/>
-          <w:lang w:val="en-US"/>
-        </w:rPr>
-        <w:t>VS</w:t>
-      </w:r>
+          <w:lang w:val="uk-UA"/>
+        </w:rPr>
+        <w:t>Code</w:t>
+      </w:r>
+      <w:proofErr w:type="spellEnd"/>
       <w:r>
         <w:rPr>
           <w:rFonts w:ascii="Times New Roman" w:hAnsi="Times New Roman" w:cs="Times New Roman"/>
           <w:sz w:val="24"/>
           <w:szCs w:val="24"/>
-        </w:rPr>
-        <w:t xml:space="preserve"> </w:t>
-      </w:r>
-      <w:r>
-        <w:rPr>
-          <w:rFonts w:ascii="Times New Roman" w:hAnsi="Times New Roman" w:cs="Times New Roman"/>
-          <w:sz w:val="24"/>
-          <w:szCs w:val="24"/>
-          <w:lang w:val="en-US"/>
-        </w:rPr>
-        <w:t>Code</w:t>
-      </w:r>
-      <w:r>
-        <w:rPr>
-          <w:rFonts w:ascii="Times New Roman" w:hAnsi="Times New Roman" w:cs="Times New Roman"/>
-          <w:sz w:val="24"/>
-          <w:szCs w:val="24"/>
-        </w:rPr>
-        <w:t xml:space="preserve"> </w:t>
-      </w:r>
-      <w:r>
-        <w:rPr>
-          <w:rFonts w:ascii="Times New Roman" w:hAnsi="Times New Roman" w:cs="Times New Roman"/>
-          <w:sz w:val="24"/>
-          <w:szCs w:val="24"/>
-          <w:lang w:val="uk-UA"/>
-        </w:rPr>
-        <w:t>та його</w:t>
-      </w:r>
-      <w:r>
-        <w:rPr>
-          <w:rFonts w:ascii="Times New Roman" w:hAnsi="Times New Roman" w:cs="Times New Roman"/>
-          <w:sz w:val="24"/>
-          <w:szCs w:val="24"/>
-        </w:rPr>
-        <w:t xml:space="preserve"> </w:t>
-      </w:r>
-      <w:r>
-        <w:rPr>
-          <w:rFonts w:ascii="Times New Roman" w:hAnsi="Times New Roman" w:cs="Times New Roman"/>
-          <w:sz w:val="24"/>
-          <w:szCs w:val="24"/>
-          <w:lang w:val="uk-UA"/>
-        </w:rPr>
-        <w:t>розширення</w:t>
+          <w:lang w:val="uk-UA"/>
+        </w:rPr>
+        <w:t xml:space="preserve"> та його розширення</w:t>
       </w:r>
     </w:p>
     <w:p>
@@ -7609,6 +7465,7 @@
           <w:rFonts w:ascii="Times New Roman" w:hAnsi="Times New Roman" w:cs="Times New Roman"/>
           <w:sz w:val="24"/>
           <w:szCs w:val="24"/>
+          <w:lang w:val="uk-UA"/>
         </w:rPr>
       </w:pPr>
     </w:p>
@@ -7624,20 +7481,7 @@
         <w:rPr>
           <w:color w:val="000000"/>
         </w:rPr>
-        <w:t>Завдання №</w:t>
-      </w:r>
-      <w:r>
-        <w:rPr>
-          <w:color w:val="000000"/>
-          <w:lang w:val="en-US"/>
-        </w:rPr>
-        <w:t>4</w:t>
-      </w:r>
-      <w:r>
-        <w:rPr>
-          <w:color w:val="000000"/>
-        </w:rPr>
-        <w:t xml:space="preserve"> </w:t>
+        <w:t xml:space="preserve">Завдання №4 </w:t>
       </w:r>
       <w:proofErr w:type="spellStart"/>
       <w:r>
@@ -7747,6 +7591,7 @@
           <w:color w:val="000000"/>
           <w:sz w:val="24"/>
           <w:szCs w:val="24"/>
+          <w:lang w:val="uk-UA"/>
         </w:rPr>
       </w:pPr>
       <w:r>
@@ -7764,7 +7609,7 @@
           <w:rFonts w:ascii="Times New Roman" w:hAnsi="Times New Roman" w:cs="Times New Roman"/>
           <w:sz w:val="24"/>
           <w:szCs w:val="24"/>
-          <w:lang w:val="en-US"/>
+          <w:lang w:val="uk-UA"/>
         </w:rPr>
         <w:t>Git</w:t>
       </w:r>
@@ -7858,15 +7703,17 @@
         </w:rPr>
         <w:t xml:space="preserve"> на </w:t>
       </w:r>
+      <w:proofErr w:type="spellStart"/>
       <w:r>
         <w:rPr>
           <w:rFonts w:ascii="Times New Roman" w:hAnsi="Times New Roman" w:cs="Times New Roman"/>
           <w:sz w:val="24"/>
           <w:szCs w:val="24"/>
-          <w:lang w:val="en-US"/>
+          <w:lang w:val="uk-UA"/>
         </w:rPr>
         <w:t>GitHub</w:t>
       </w:r>
+      <w:proofErr w:type="spellEnd"/>
     </w:p>
     <w:p>
       <w:pPr>
@@ -7875,6 +7722,7 @@
           <w:color w:val="000000"/>
           <w:sz w:val="24"/>
           <w:szCs w:val="24"/>
+          <w:lang w:val="uk-UA"/>
         </w:rPr>
       </w:pPr>
       <w:r>
@@ -8243,9 +8091,11 @@
           <w:color w:val="000000"/>
           <w:sz w:val="24"/>
           <w:szCs w:val="24"/>
-        </w:rPr>
-        <w:t>Завдання №</w:t>
-      </w:r>
+          <w:lang w:val="uk-UA"/>
+        </w:rPr>
+        <w:t xml:space="preserve">Завдання №5 </w:t>
+      </w:r>
+      <w:proofErr w:type="spellStart"/>
       <w:r>
         <w:rPr>
           <w:rFonts w:ascii="Times New Roman" w:hAnsi="Times New Roman" w:cs="Times New Roman"/>
@@ -8253,25 +8103,6 @@
           <w:sz w:val="24"/>
           <w:szCs w:val="24"/>
           <w:lang w:val="uk-UA"/>
-        </w:rPr>
-        <w:t>5</w:t>
-      </w:r>
-      <w:r>
-        <w:rPr>
-          <w:rFonts w:ascii="Times New Roman" w:hAnsi="Times New Roman" w:cs="Times New Roman"/>
-          <w:color w:val="000000"/>
-          <w:sz w:val="24"/>
-          <w:szCs w:val="24"/>
-        </w:rPr>
-        <w:t xml:space="preserve"> </w:t>
-      </w:r>
-      <w:proofErr w:type="spellStart"/>
-      <w:r>
-        <w:rPr>
-          <w:rFonts w:ascii="Times New Roman" w:hAnsi="Times New Roman" w:cs="Times New Roman"/>
-          <w:color w:val="000000"/>
-          <w:sz w:val="24"/>
-          <w:szCs w:val="24"/>
         </w:rPr>
         <w:t>Algotester</w:t>
       </w:r>
@@ -8289,20 +8120,8 @@
         <w:rPr>
           <w:color w:val="000000"/>
         </w:rPr>
-        <w:t>Завдання №</w:t>
-      </w:r>
-      <w:r>
-        <w:rPr>
-          <w:color w:val="000000"/>
-          <w:lang w:val="en-US"/>
-        </w:rPr>
-        <w:t>6</w:t>
-      </w:r>
-      <w:r>
-        <w:rPr>
-          <w:color w:val="000000"/>
-        </w:rPr>
-        <w:t xml:space="preserve"> </w:t>
+        <w:lastRenderedPageBreak/>
+        <w:t xml:space="preserve">Завдання №6 </w:t>
       </w:r>
       <w:proofErr w:type="spellStart"/>
       <w:r>
@@ -8480,6 +8299,7 @@
           <w:rFonts w:ascii="Times New Roman" w:hAnsi="Times New Roman" w:cs="Times New Roman"/>
           <w:sz w:val="24"/>
           <w:szCs w:val="24"/>
+          <w:lang w:val="uk-UA"/>
         </w:rPr>
       </w:pPr>
       <w:r>
@@ -8565,6 +8385,7 @@
           <w:color w:val="000000"/>
           <w:sz w:val="24"/>
           <w:szCs w:val="24"/>
+          <w:lang w:val="uk-UA"/>
         </w:rPr>
       </w:pPr>
       <w:r>
@@ -8606,6 +8427,7 @@
           <w:rFonts w:ascii="Times New Roman" w:hAnsi="Times New Roman" w:cs="Times New Roman"/>
           <w:sz w:val="24"/>
           <w:szCs w:val="24"/>
+          <w:lang w:val="uk-UA"/>
         </w:rPr>
       </w:pPr>
       <w:r>
@@ -8614,6 +8436,7 @@
           <w:color w:val="000000"/>
           <w:sz w:val="24"/>
           <w:szCs w:val="24"/>
+          <w:lang w:val="uk-UA"/>
         </w:rPr>
         <w:t xml:space="preserve">4. </w:t>
       </w:r>
@@ -8624,6 +8447,7 @@
           <w:color w:val="000000"/>
           <w:sz w:val="24"/>
           <w:szCs w:val="24"/>
+          <w:lang w:val="uk-UA"/>
         </w:rPr>
         <w:tab/>
       </w:r>
@@ -8633,6 +8457,7 @@
           <w:color w:val="000000"/>
           <w:sz w:val="24"/>
           <w:szCs w:val="24"/>
+          <w:lang w:val="uk-UA"/>
         </w:rPr>
         <w:t>Код програм з посиланням на зовнішні ресурси:</w:t>
       </w:r>
@@ -9455,6 +9280,7 @@
           <w:szCs w:val="24"/>
           <w:lang w:val="uk-UA"/>
         </w:rPr>
+        <w:lastRenderedPageBreak/>
         <w:t xml:space="preserve">    </w:t>
       </w:r>
       <w:proofErr w:type="spellStart"/>
@@ -13111,6 +12937,7 @@
           <w:szCs w:val="24"/>
           <w:lang w:val="uk-UA"/>
         </w:rPr>
+        <w:lastRenderedPageBreak/>
         <w:t xml:space="preserve">    </w:t>
       </w:r>
       <w:proofErr w:type="spellStart"/>
@@ -17672,7 +17499,7 @@
           <w:rFonts w:ascii="Times New Roman" w:hAnsi="Times New Roman" w:cs="Times New Roman"/>
           <w:sz w:val="24"/>
           <w:szCs w:val="24"/>
-          <w:lang w:val="ru-RU"/>
+          <w:lang w:val="uk-UA"/>
         </w:rPr>
       </w:pPr>
       <w:r>
@@ -17851,6 +17678,7 @@
           <w:szCs w:val="24"/>
           <w:lang w:val="uk-UA"/>
         </w:rPr>
+        <w:lastRenderedPageBreak/>
         <w:t xml:space="preserve"> /*Епік 1. </w:t>
       </w:r>
       <w:proofErr w:type="spellStart"/>
@@ -19201,6 +19029,7 @@
           <w:sz w:val="24"/>
           <w:szCs w:val="24"/>
           <w:shd w:val="clear" w:color="auto" w:fill="FFF2CC"/>
+          <w:lang w:val="uk-UA"/>
         </w:rPr>
       </w:pPr>
       <w:r>
@@ -19218,7 +19047,7 @@
           <w:rFonts w:ascii="Times New Roman" w:hAnsi="Times New Roman" w:cs="Times New Roman"/>
           <w:sz w:val="24"/>
           <w:szCs w:val="24"/>
-          <w:lang w:val="en-US"/>
+          <w:lang w:val="uk-UA"/>
         </w:rPr>
         <w:t>Algotester</w:t>
       </w:r>
@@ -19273,8 +19102,6 @@
           <w:t>посилання на 2 задачу</w:t>
         </w:r>
       </w:hyperlink>
-      <w:bookmarkStart w:id="0" w:name="_GoBack"/>
-      <w:bookmarkEnd w:id="0"/>
     </w:p>
     <w:p>
       <w:pPr>
@@ -19284,6 +19111,7 @@
           <w:rFonts w:ascii="Times New Roman" w:hAnsi="Times New Roman" w:cs="Times New Roman"/>
           <w:sz w:val="24"/>
           <w:szCs w:val="24"/>
+          <w:lang w:val="uk-UA"/>
         </w:rPr>
       </w:pPr>
       <w:r>
@@ -19292,6 +19120,7 @@
           <w:color w:val="000000"/>
           <w:sz w:val="24"/>
           <w:szCs w:val="24"/>
+          <w:lang w:val="uk-UA"/>
         </w:rPr>
         <w:t>5.</w:t>
       </w:r>
@@ -19302,6 +19131,7 @@
           <w:color w:val="000000"/>
           <w:sz w:val="24"/>
           <w:szCs w:val="24"/>
+          <w:lang w:val="uk-UA"/>
         </w:rPr>
         <w:tab/>
       </w:r>
@@ -19311,6 +19141,7 @@
           <w:color w:val="000000"/>
           <w:sz w:val="24"/>
           <w:szCs w:val="24"/>
+          <w:lang w:val="uk-UA"/>
         </w:rPr>
         <w:t>Результати виконання завдань, тестування та фактично затрачений час:</w:t>
       </w:r>
@@ -19409,6 +19240,7 @@
           <w:rFonts w:ascii="Times New Roman" w:hAnsi="Times New Roman" w:cs="Times New Roman"/>
           <w:sz w:val="24"/>
           <w:szCs w:val="24"/>
+          <w:lang w:val="uk-UA"/>
         </w:rPr>
       </w:pPr>
       <w:r>
@@ -19419,6 +19251,7 @@
           <w:szCs w:val="24"/>
           <w:lang w:val="uk-UA"/>
         </w:rPr>
+        <w:lastRenderedPageBreak/>
         <w:drawing>
           <wp:inline distT="0" distB="0" distL="0" distR="0" wp14:anchorId="0F861FC1" wp14:editId="277CEFB4">
             <wp:extent cx="4163006" cy="1143160"/>
@@ -19464,7 +19297,7 @@
           <w:rFonts w:ascii="Times New Roman" w:hAnsi="Times New Roman" w:cs="Times New Roman"/>
           <w:sz w:val="24"/>
           <w:szCs w:val="24"/>
-          <w:lang w:val="ru-RU"/>
+          <w:lang w:val="uk-UA"/>
         </w:rPr>
       </w:pPr>
       <w:r>
@@ -19474,9 +19307,8 @@
           <w:szCs w:val="24"/>
           <w:lang w:val="uk-UA"/>
         </w:rPr>
-        <w:t xml:space="preserve">Вивід за некоректного </w:t>
-      </w:r>
-      <w:proofErr w:type="spellStart"/>
+        <w:t>Вивід за некоректного введе</w:t>
+      </w:r>
       <w:r>
         <w:rPr>
           <w:rFonts w:ascii="Times New Roman" w:hAnsi="Times New Roman" w:cs="Times New Roman"/>
@@ -19484,9 +19316,17 @@
           <w:szCs w:val="24"/>
           <w:lang w:val="uk-UA"/>
         </w:rPr>
-        <w:t>введеня</w:t>
-      </w:r>
-      <w:proofErr w:type="spellEnd"/>
+        <w:t>н</w:t>
+      </w:r>
+      <w:r>
+        <w:rPr>
+          <w:rFonts w:ascii="Times New Roman" w:hAnsi="Times New Roman" w:cs="Times New Roman"/>
+          <w:sz w:val="24"/>
+          <w:szCs w:val="24"/>
+          <w:lang w:val="uk-UA"/>
+        </w:rPr>
+        <w:t>ня</w:t>
+      </w:r>
     </w:p>
     <w:p>
       <w:pPr>
@@ -19641,6 +19481,7 @@
           <w:color w:val="auto"/>
           <w:sz w:val="24"/>
           <w:szCs w:val="24"/>
+          <w:lang w:val="uk-UA"/>
         </w:rPr>
       </w:pPr>
       <w:r>
@@ -19954,6 +19795,7 @@
           <w:color w:val="000000"/>
           <w:sz w:val="24"/>
           <w:szCs w:val="24"/>
+          <w:lang w:val="uk-UA"/>
         </w:rPr>
         <w:t>6.</w:t>
       </w:r>
@@ -19964,6 +19806,7 @@
           <w:color w:val="000000"/>
           <w:sz w:val="24"/>
           <w:szCs w:val="24"/>
+          <w:lang w:val="uk-UA"/>
         </w:rPr>
         <w:tab/>
       </w:r>
@@ -19973,6 +19816,7 @@
           <w:color w:val="000000"/>
           <w:sz w:val="24"/>
           <w:szCs w:val="24"/>
+          <w:lang w:val="uk-UA"/>
         </w:rPr>
         <w:t>Кооперація з командою:</w:t>
       </w:r>
@@ -20012,6 +19856,7 @@
           <w:rFonts w:ascii="Times New Roman" w:hAnsi="Times New Roman" w:cs="Times New Roman"/>
           <w:sz w:val="24"/>
           <w:szCs w:val="24"/>
+          <w:lang w:val="uk-UA"/>
         </w:rPr>
       </w:pPr>
     </w:p>
@@ -20024,6 +19869,7 @@
           <w:color w:val="000000"/>
           <w:sz w:val="24"/>
           <w:szCs w:val="24"/>
+          <w:lang w:val="uk-UA"/>
         </w:rPr>
       </w:pPr>
       <w:r>
@@ -20032,6 +19878,7 @@
           <w:color w:val="000000"/>
           <w:sz w:val="24"/>
           <w:szCs w:val="24"/>
+          <w:lang w:val="uk-UA"/>
         </w:rPr>
         <w:t>Висновки: </w:t>
       </w:r>
@@ -20042,6 +19889,7 @@
           <w:rFonts w:ascii="Times New Roman" w:hAnsi="Times New Roman" w:cs="Times New Roman"/>
           <w:sz w:val="24"/>
           <w:szCs w:val="24"/>
+          <w:lang w:val="uk-UA"/>
         </w:rPr>
       </w:pPr>
       <w:r>
@@ -20049,15 +19897,27 @@
           <w:rFonts w:ascii="Times New Roman" w:hAnsi="Times New Roman" w:cs="Times New Roman"/>
           <w:sz w:val="24"/>
           <w:szCs w:val="24"/>
-        </w:rPr>
-        <w:t xml:space="preserve">Упродовж виконання поставлених завдань було здійснено комплексне ознайомлення з інструментарієм, необхідним для ефективної розробки програмного забезпечення мовою C++. Отримані знання дозволяють перейти до складніших </w:t>
-      </w:r>
-      <w:proofErr w:type="spellStart"/>
+          <w:lang w:val="uk-UA"/>
+        </w:rPr>
+        <w:t xml:space="preserve">Упродовж виконання поставлених завдань було здійснено комплексне ознайомлення з інструментарієм, необхідним для ефективної розробки програмного забезпечення </w:t>
+      </w:r>
       <w:r>
         <w:rPr>
           <w:rFonts w:ascii="Times New Roman" w:hAnsi="Times New Roman" w:cs="Times New Roman"/>
           <w:sz w:val="24"/>
           <w:szCs w:val="24"/>
+          <w:lang w:val="uk-UA"/>
+        </w:rPr>
+        <w:lastRenderedPageBreak/>
+        <w:t xml:space="preserve">мовою C++. Отримані знання дозволяють перейти до складніших </w:t>
+      </w:r>
+      <w:proofErr w:type="spellStart"/>
+      <w:r>
+        <w:rPr>
+          <w:rFonts w:ascii="Times New Roman" w:hAnsi="Times New Roman" w:cs="Times New Roman"/>
+          <w:sz w:val="24"/>
+          <w:szCs w:val="24"/>
+          <w:lang w:val="uk-UA"/>
         </w:rPr>
         <w:t>проєктів</w:t>
       </w:r>
@@ -20067,6 +19927,7 @@
           <w:rFonts w:ascii="Times New Roman" w:hAnsi="Times New Roman" w:cs="Times New Roman"/>
           <w:sz w:val="24"/>
           <w:szCs w:val="24"/>
+          <w:lang w:val="uk-UA"/>
         </w:rPr>
         <w:t xml:space="preserve"> та глибшого вивчення мови програмування.</w:t>
       </w:r>
@@ -20076,6 +19937,7 @@
         <w:rPr>
           <w:rFonts w:ascii="Times New Roman" w:hAnsi="Times New Roman" w:cs="Times New Roman"/>
           <w:sz w:val="24"/>
+          <w:lang w:val="uk-UA"/>
         </w:rPr>
       </w:pPr>
     </w:p>
@@ -20084,12 +19946,14 @@
         <w:rPr>
           <w:rFonts w:ascii="Times New Roman" w:hAnsi="Times New Roman" w:cs="Times New Roman"/>
           <w:sz w:val="24"/>
+          <w:lang w:val="uk-UA"/>
         </w:rPr>
       </w:pPr>
       <w:r>
         <w:rPr>
           <w:rFonts w:ascii="Times New Roman" w:hAnsi="Times New Roman" w:cs="Times New Roman"/>
           <w:sz w:val="24"/>
+          <w:lang w:val="uk-UA"/>
         </w:rPr>
         <w:t>Здобуті навички:</w:t>
       </w:r>
@@ -20784,12 +20648,13 @@
     </w:p>
     <w:sectPr>
       <w:footerReference w:type="default" r:id="rId38"/>
-      <w:headerReference w:type="first" r:id="rId39"/>
-      <w:footerReference w:type="first" r:id="rId40"/>
+      <w:footerReference w:type="first" r:id="rId39"/>
       <w:pgSz w:w="11909" w:h="16834"/>
       <w:pgMar w:top="1440" w:right="1440" w:bottom="1440" w:left="1440" w:header="720" w:footer="720" w:gutter="0"/>
       <w:pgNumType w:start="1"/>
       <w:cols w:space="720"/>
+      <w:titlePg/>
+      <w:docGrid w:linePitch="299"/>
     </w:sectPr>
   </w:body>
 </w:document>
@@ -20825,10 +20690,10 @@
   <w:p>
     <w:pPr>
       <w:jc w:val="center"/>
+      <w:rPr>
+        <w:lang w:val="uk-UA"/>
+      </w:rPr>
     </w:pPr>
-    <w:r>
-      <w:t>2026</w:t>
-    </w:r>
   </w:p>
 </w:ftr>
 </file>
@@ -20837,10 +20702,20 @@
 <w:ftr xmlns:wpc="http://schemas.microsoft.com/office/word/2010/wordprocessingCanvas" xmlns:cx="http://schemas.microsoft.com/office/drawing/2014/chartex" xmlns:mc="http://schemas.openxmlformats.org/markup-compatibility/2006" xmlns:o="urn:schemas-microsoft-com:office:office" xmlns:r="http://schemas.openxmlformats.org/officeDocument/2006/relationships" xmlns:m="http://schemas.openxmlformats.org/officeDocument/2006/math" xmlns:v="urn:schemas-microsoft-com:vml" xmlns:wp14="http://schemas.microsoft.com/office/word/2010/wordprocessingDrawing" xmlns:wp="http://schemas.openxmlformats.org/drawingml/2006/wordprocessingDrawing" xmlns:w10="urn:schemas-microsoft-com:office:word" xmlns:w="http://schemas.openxmlformats.org/wordprocessingml/2006/main" xmlns:w14="http://schemas.microsoft.com/office/word/2010/wordml" xmlns:w15="http://schemas.microsoft.com/office/word/2012/wordml" xmlns:w16se="http://schemas.microsoft.com/office/word/2015/wordml/symex" xmlns:wpg="http://schemas.microsoft.com/office/word/2010/wordprocessingGroup" xmlns:wpi="http://schemas.microsoft.com/office/word/2010/wordprocessingInk" xmlns:wne="http://schemas.microsoft.com/office/word/2006/wordml" xmlns:wps="http://schemas.microsoft.com/office/word/2010/wordprocessingShape" mc:Ignorable="w14 w15 w16se wp14">
   <w:p>
     <w:pPr>
+      <w:pStyle w:val="ac"/>
       <w:rPr>
-        <w:ins w:id="2" w:author="Андрій Сачковський" w:date="2026-09-16T21:11:00Z"/>
+        <w:lang w:val="uk-UA"/>
       </w:rPr>
     </w:pPr>
+    <w:r>
+      <w:tab/>
+    </w:r>
+    <w:r>
+      <w:rPr>
+        <w:lang w:val="uk-UA"/>
+      </w:rPr>
+      <w:t>2026</w:t>
+    </w:r>
   </w:p>
 </w:ftr>
 </file>
@@ -20868,18 +20743,6 @@
     </w:p>
   </w:footnote>
 </w:footnotes>
-</file>
-
-<file path=word/header1.xml><?xml version="1.0" encoding="utf-8"?>
-<w:hdr xmlns:wpc="http://schemas.microsoft.com/office/word/2010/wordprocessingCanvas" xmlns:cx="http://schemas.microsoft.com/office/drawing/2014/chartex" xmlns:mc="http://schemas.openxmlformats.org/markup-compatibility/2006" xmlns:o="urn:schemas-microsoft-com:office:office" xmlns:r="http://schemas.openxmlformats.org/officeDocument/2006/relationships" xmlns:m="http://schemas.openxmlformats.org/officeDocument/2006/math" xmlns:v="urn:schemas-microsoft-com:vml" xmlns:wp14="http://schemas.microsoft.com/office/word/2010/wordprocessingDrawing" xmlns:wp="http://schemas.openxmlformats.org/drawingml/2006/wordprocessingDrawing" xmlns:w10="urn:schemas-microsoft-com:office:word" xmlns:w="http://schemas.openxmlformats.org/wordprocessingml/2006/main" xmlns:w14="http://schemas.microsoft.com/office/word/2010/wordml" xmlns:w15="http://schemas.microsoft.com/office/word/2012/wordml" xmlns:w16se="http://schemas.microsoft.com/office/word/2015/wordml/symex" xmlns:wpg="http://schemas.microsoft.com/office/word/2010/wordprocessingGroup" xmlns:wpi="http://schemas.microsoft.com/office/word/2010/wordprocessingInk" xmlns:wne="http://schemas.microsoft.com/office/word/2006/wordml" xmlns:wps="http://schemas.microsoft.com/office/word/2010/wordprocessingShape" mc:Ignorable="w14 w15 w16se wp14">
-  <w:p>
-    <w:pPr>
-      <w:rPr>
-        <w:ins w:id="1" w:author="Андрій Сачковський" w:date="2026-09-16T21:11:00Z"/>
-      </w:rPr>
-    </w:pPr>
-  </w:p>
-</w:hdr>
 </file>
 
 <file path=word/numbering.xml><?xml version="1.0" encoding="utf-8"?>
@@ -24053,6 +23916,50 @@
       <w:szCs w:val="18"/>
     </w:rPr>
   </w:style>
+  <w:style w:type="paragraph" w:styleId="aa">
+    <w:name w:val="header"/>
+    <w:basedOn w:val="a"/>
+    <w:link w:val="ab"/>
+    <w:uiPriority w:val="99"/>
+    <w:unhideWhenUsed/>
+    <w:rsid w:val="00AD6859"/>
+    <w:pPr>
+      <w:tabs>
+        <w:tab w:val="center" w:pos="4819"/>
+        <w:tab w:val="right" w:pos="9639"/>
+      </w:tabs>
+      <w:spacing w:line="240" w:lineRule="auto"/>
+    </w:pPr>
+  </w:style>
+  <w:style w:type="character" w:customStyle="1" w:styleId="ab">
+    <w:name w:val="Верхний колонтитул Знак"/>
+    <w:basedOn w:val="a0"/>
+    <w:link w:val="aa"/>
+    <w:uiPriority w:val="99"/>
+    <w:rsid w:val="00AD6859"/>
+  </w:style>
+  <w:style w:type="paragraph" w:styleId="ac">
+    <w:name w:val="footer"/>
+    <w:basedOn w:val="a"/>
+    <w:link w:val="ad"/>
+    <w:uiPriority w:val="99"/>
+    <w:unhideWhenUsed/>
+    <w:rsid w:val="00AD6859"/>
+    <w:pPr>
+      <w:tabs>
+        <w:tab w:val="center" w:pos="4819"/>
+        <w:tab w:val="right" w:pos="9639"/>
+      </w:tabs>
+      <w:spacing w:line="240" w:lineRule="auto"/>
+    </w:pPr>
+  </w:style>
+  <w:style w:type="character" w:customStyle="1" w:styleId="ad">
+    <w:name w:val="Нижний колонтитул Знак"/>
+    <w:basedOn w:val="a0"/>
+    <w:link w:val="ac"/>
+    <w:uiPriority w:val="99"/>
+    <w:rsid w:val="00AD6859"/>
+  </w:style>
 </w:styles>
 </file>
 
@@ -24381,7 +24288,7 @@
 </file>
 
 <file path=customXml/itemProps1.xml><?xml version="1.0" encoding="utf-8"?>
-<ds:datastoreItem xmlns:ds="http://schemas.openxmlformats.org/officeDocument/2006/customXml" ds:itemID="{40AB167C-039B-461F-AE1C-AA142DE2C54D}">
+<ds:datastoreItem xmlns:ds="http://schemas.openxmlformats.org/officeDocument/2006/customXml" ds:itemID="{DE7A5FBD-9F46-4D3F-83E5-8FA0D3A27CF7}">
   <ds:schemaRefs>
     <ds:schemaRef ds:uri="http://schemas.openxmlformats.org/officeDocument/2006/bibliography"/>
   </ds:schemaRefs>

</xml_diff>